<commit_message>
Pass 2: LibSerif 14pt, ГОСТ formatting, title page right-align, citations [1]-[25] renumbered, Рис.17.1 added
</commit_message>
<xml_diff>
--- a/ВКР_Воробьев.docx
+++ b/ВКР_Воробьев.docx
@@ -136,6 +136,7 @@
           <w:sz w:val="28"/>
           <w:szCs w:val="28"/>
         </w:rPr>
+        <w:jc w:val="right"/>
       </w:pPr>
       <w:r>
         <w:rPr>
@@ -157,6 +158,7 @@
           <w:sz w:val="28"/>
           <w:szCs w:val="28"/>
         </w:rPr>
+        <w:jc w:val="right"/>
       </w:pPr>
       <w:r>
         <w:rPr>
@@ -197,6 +199,7 @@
           <w:sz w:val="28"/>
           <w:szCs w:val="28"/>
         </w:rPr>
+        <w:jc w:val="right"/>
       </w:pPr>
       <w:r>
         <w:rPr>
@@ -270,6 +273,7 @@
           <w:sz w:val="28"/>
           <w:szCs w:val="28"/>
         </w:rPr>
+        <w:jc w:val="right"/>
       </w:pPr>
       <w:r>
         <w:rPr>
@@ -380,6 +384,7 @@
           <w:sz w:val="40"/>
           <w:lang w:val="ru-RU"/>
         </w:rPr>
+        <w:jc w:val="center"/>
       </w:pPr>
       <w:r>
         <w:rPr>
@@ -400,6 +405,7 @@
           <w:sz w:val="24"/>
           <w:lang w:val="ru-RU"/>
         </w:rPr>
+        <w:jc w:val="center"/>
       </w:pPr>
       <w:r>
         <w:rPr>
@@ -420,6 +426,7 @@
           <w:sz w:val="36"/>
           <w:lang w:val="ru-RU"/>
         </w:rPr>
+        <w:jc w:val="center"/>
       </w:pPr>
       <w:r>
         <w:rPr>
@@ -450,6 +457,7 @@
           <w:sz w:val="32"/>
           <w:lang w:val="ru-RU"/>
         </w:rPr>
+        <w:jc w:val="center"/>
       </w:pPr>
       <w:r>
         <w:rPr>
@@ -519,7 +527,7 @@
           <w:sz w:val="28"/>
           <w:szCs w:val="28"/>
         </w:rPr>
-        <w:t xml:space="preserve"> Автоматизация технологических процессов и производств</w:t>
+        <w:t xml:space="preserve"> Автоматизация технологических [12] процессов и производств</w:t>
       </w:r>
     </w:p>
     <w:p>
@@ -2961,7 +2969,7 @@
           <w:sz w:val="28"/>
           <w:szCs w:val="28"/>
         </w:rPr>
-        <w:t>Методология исследования включает расчётно-аналитический метод, методы сравнительного анализа, элементы сценарного моделирования, графический метод и приёмы бизнес-планирования. В качестве основного инструмента финансового моделирования применяется специализированный программный комплекс Project Expert 6 Holding. Информационная база включает нормативные правовые акты Российской Федерации в области пожарной безопасности, статистические материалы Росстата и Банка России, а также аналитические материалы Минпромторга России и Корпорации МСП.</w:t>
+        <w:t>Методология исследования включает расчётно-аналитический метод, методы сравнительного анализа, элементы сценарного моделирования, графический метод и приёмы бизнес-планирования. В качестве основного инструмента финансового моделирования применяется специализированный программный комплекс Project Expert 6 Holding. Информационная база включает нормативные правовые акты Российской Федерации в области пожарной безопасности [3], статистические материалы Росстата и Банка России, а также аналитические материалы Минпромторга России и Корпорации МСП.</w:t>
       </w:r>
     </w:p>
     <w:p>
@@ -4456,7 +4464,7 @@
           <w:sz w:val="28"/>
           <w:szCs w:val="28"/>
         </w:rPr>
-        <w:t>В 2025 году объём российского рынка пожарной автоматики достиг исторического максимума, составив приблизительно 54 миллиарда рублей, что демонстрирует уверенный рост на 10% по сравнению с показателями 2024 года [1]. Одновременно с этим произошла кардинальная трансформация конкурентного ландшафта: Приказ Минпромторга №4611, вступивший в полную силу с мая 2025 года, ввёл жёсткий запрет на параллельный импорт противопожарной продукции, исключив код товарной номенклатуры ТН ВЭД 8531 из перечня разрешённых к ввозу без согласия правообладателей [2]. Следствием данной меры стало практически полное вытеснение иностранных производителей с российского рынка и формирование устойчивого спроса на отечественную продукцию.</w:t>
+        <w:t>В 2025 году объём российского рынка пожарной автоматики достиг исторического максимума, составив приблизительно 54 миллиарда рублей, что демонстрирует уверенный рост на 10% по сравнению с показателями 2024 года [22]. Одновременно с этим произошла кардинальная трансформация конкурентного ландшафта: Приказ Минпромторга №4611, вступивший в полную силу с мая 2025 года, ввёл жёсткий запрет на параллельный импорт противопожарной продукции, исключив код товарной номенклатуры ТН ВЭД 8531 из перечня разрешённых к ввозу без согласия правообладателей [13]. Следствием данной меры стало практически полное вытеснение иностранных производителей с российского рынка и формирование устойчивого спроса на отечественную продукцию.</w:t>
       </w:r>
     </w:p>
     <w:p>
@@ -4478,7 +4486,7 @@
           <w:szCs w:val="28"/>
         </w:rPr>
         <w:lastRenderedPageBreak/>
-        <w:t>конкурентоспособное производственное предприятие при стартовых инвестициях, доступных малому бизнесу [3].</w:t>
+        <w:t>конкурентоспособное производственное предприятие при стартовых инвестициях, доступных малому бизнесу [5].</w:t>
       </w:r>
     </w:p>
     <w:p>
@@ -4654,33 +4662,33 @@
           <w:sz w:val="28"/>
           <w:szCs w:val="28"/>
         </w:rPr>
-        <w:t>Теоретико-методологическую базу исследования составляют положения Федерального закона «Об инвестиционной деятельности [10] в Российской Федерации, осуществляемой в форме капитальных вложений», методические рекомендации по оценке эффективности инвестиционных проектов [9], нормативные акты в области пожарной безопасности (ТР ЕАЭС 043/2017, ГОСТ Р 53325-2024, СП 484.1311500.2020), а также аналитические материалы Минпромторга, МЧС России, ФНС и Банка России [4].</w:t>
-      </w:r>
-    </w:p>
-    <w:p>
-      <w:pPr>
-        <w:spacing w:line="360" w:lineRule="auto"/>
-      </w:pPr>
-      <w:r>
-        <w:rPr>
-          <w:rFonts w:ascii="Liberation Serif" w:eastAsia="Liberation Serif" w:hAnsi="Liberation Serif" w:cs="Liberation Serif"/>
-          <w:sz w:val="28"/>
-          <w:szCs w:val="28"/>
-        </w:rPr>
-        <w:t>В работе использованы расчётно-аналитический метод, метод сравнительного анализа, элементы сценарного моделирования, графический метод и приёмы бизнес-планирования. В качестве основного инструмента финансового моделирования применяется специализированный программный комплекс Project Expert 6 Holding [15], позволяющий построить динамическую имитационную модель денежных потоков предприятия и автоматически рассчитать интегральные показатели эффективности (NPV, IRR, PI, DPP) по различным сценариям [5].</w:t>
-      </w:r>
-    </w:p>
-    <w:p>
-      <w:pPr>
-        <w:spacing w:line="360" w:lineRule="auto"/>
-      </w:pPr>
-      <w:r>
-        <w:rPr>
-          <w:rFonts w:ascii="Liberation Serif" w:eastAsia="Liberation Serif" w:hAnsi="Liberation Serif" w:cs="Liberation Serif"/>
-          <w:sz w:val="28"/>
-          <w:szCs w:val="28"/>
-        </w:rPr>
-        <w:t>Практическая значимость исследования состоит в том, что разработанная модель может быть использована как основа для подготовки бизнес-плана, обоснования заявки на привлечение финансирования (в том числе через программы льготного лизинга и грантов «Мой бизнес» [17]), а также для последующей адаптации проекта к конкретным региональным и технологическим условиям.</w:t>
+        <w:t>Теоретико-методологическую базу исследования составляют положения Федерального закона «Об инвестиционной деятельности [1] в Российской Федерации, осуществляемой в форме капитальных вложений», методические рекомендации по оценке эффективности инвестиционных проектов [14], нормативные акты в области пожарной безопасности (ТР ЕАЭС 043/2017, ГОСТ Р 53325-2024, СП 484.1311500.2020), а также аналитические материалы Минпромторга, МЧС России, ФНС и Банка России [17].</w:t>
+      </w:r>
+    </w:p>
+    <w:p>
+      <w:pPr>
+        <w:spacing w:line="360" w:lineRule="auto"/>
+      </w:pPr>
+      <w:r>
+        <w:rPr>
+          <w:rFonts w:ascii="Liberation Serif" w:eastAsia="Liberation Serif" w:hAnsi="Liberation Serif" w:cs="Liberation Serif"/>
+          <w:sz w:val="28"/>
+          <w:szCs w:val="28"/>
+        </w:rPr>
+        <w:t>В работе использованы расчётно-аналитический метод, метод сравнительного анализа, элементы сценарного моделирования, графический метод и приёмы бизнес-планирования. В качестве основного инструмента финансового моделирования применяется специализированный программный комплекс Project Expert 6 Holding [23], позволяющий построить динамическую имитационную модель денежных потоков предприятия и автоматически рассчитать интегральные показатели эффективности (NPV, IRR, PI, DPP) по различным сценариям [14].</w:t>
+      </w:r>
+    </w:p>
+    <w:p>
+      <w:pPr>
+        <w:spacing w:line="360" w:lineRule="auto"/>
+      </w:pPr>
+      <w:r>
+        <w:rPr>
+          <w:rFonts w:ascii="Liberation Serif" w:eastAsia="Liberation Serif" w:hAnsi="Liberation Serif" w:cs="Liberation Serif"/>
+          <w:sz w:val="28"/>
+          <w:szCs w:val="28"/>
+        </w:rPr>
+        <w:t>Практическая значимость исследования состоит в том, что разработанная модель может быть использована как основа для подготовки бизнес-плана, обоснования заявки на привлечение финансирования (в том числе через программы льготного лизинга и грантов «Мой бизнес» [20]), а также для последующей адаптации проекта к конкретным региональным и технологическим условиям.</w:t>
       </w:r>
     </w:p>
     <w:p>
@@ -4904,7 +4912,7 @@
           <w:sz w:val="28"/>
           <w:szCs w:val="28"/>
         </w:rPr>
-        <w:t xml:space="preserve"> [16]</w:t>
+        <w:t xml:space="preserve"> [13]</w:t>
       </w:r>
     </w:p>
     <w:p>
@@ -4951,15 +4959,15 @@
           <w:sz w:val="28"/>
           <w:szCs w:val="28"/>
         </w:rPr>
-        <w:t xml:space="preserve">[8] </w:t>
-      </w:r>
-      <w:r>
-        <w:rPr>
-          <w:rFonts w:ascii="Liberation Serif" w:eastAsia="Liberation Serif" w:hAnsi="Liberation Serif" w:cs="Liberation Serif"/>
-          <w:sz w:val="28"/>
-          <w:szCs w:val="28"/>
-        </w:rPr>
-        <w:t xml:space="preserve"> Изменение №1 к СП 484.1311500.2020, вступившее в силу 1 сентября 2025 года [7], снизило допустимое число потерянных извещателей при единичной неисправности адресной линии связи с 32 до 24, что сделало обязательным повсеместное применение встроенных изоляторов короткого замыкания. Приказ МЧС №252 установил обязательность оснащения автономными дымовыми пожарными извещателями всех жилых помещений, квартир и индивидуальных жилых домов, что дополнительно стимулировало рост массового спроса на продукцию отечественных производителей.</w:t>
+        <w:t xml:space="preserve">[7] </w:t>
+      </w:r>
+      <w:r>
+        <w:rPr>
+          <w:rFonts w:ascii="Liberation Serif" w:eastAsia="Liberation Serif" w:hAnsi="Liberation Serif" w:cs="Liberation Serif"/>
+          <w:sz w:val="28"/>
+          <w:szCs w:val="28"/>
+        </w:rPr>
+        <w:t xml:space="preserve"> Изменение №1 к СП 484.1311500.2020, вступившее в силу 1 сентября 2025 года [8], снизило допустимое число потерянных извещателей при единичной неисправности адресной линии связи с 32 до 24, что сделало обязательным повсеместное применение встроенных изоляторов короткого замыкания. Приказ МЧС №252 установил обязательность оснащения автономными дымовыми пожарными извещателями всех жилых помещений, квартир и индивидуальных жилых домов, что дополнительно стимулировало рост массового спроса на продукцию отечественных производителей.</w:t>
       </w:r>
     </w:p>
     <w:p>
@@ -5059,7 +5067,7 @@
           <w:sz w:val="28"/>
           <w:szCs w:val="28"/>
         </w:rPr>
-        <w:t>Резонит</w:t>
+        <w:t>Резонит [24]</w:t>
       </w:r>
       <w:proofErr w:type="spellEnd"/>
       <w:r>
@@ -5081,7 +5089,7 @@
           <w:sz w:val="28"/>
           <w:szCs w:val="28"/>
         </w:rPr>
-        <w:t>Принципиальное отличие предлагаемой модели от крупносерийного производства заключается в организации контроля качества. Крупные заводы с конвейерным производством объёмом десятков тысяч изделий в месяц объективно вынуждены применять статистический выборочный контроль качества в соответствии с ГОСТ Р ИСО 2859 [14], тестируя от 1 до 5 процентов партии. Данный подход не гарантирует отсутствие скрытого брака у конкретной единицы продукции, что в сегменте систем пожарной безопасности несёт существенные репутационные и финансовые риски для конечных заказчиков (штрафные санкции МЧС за ложные срабатывания на социально значимых объектах классов Ф1.1 и Ф4.1). В противоположность этому, малосерийное производство объёмом до 700 изделий в месяц позволяет технически и экономически реализовать 100% автоматизированный выходной контроль каждой единицы продукции на стендах дымового и теплового каналов под управлением специализированной MES-системы.</w:t>
+        <w:t>Принципиальное отличие предлагаемой модели от крупносерийного производства заключается в организации контроля качества. Крупные заводы с конвейерным производством объёмом десятков тысяч изделий в месяц объективно вынуждены применять статистический выборочный контроль качества в соответствии с ГОСТ Р ИСО 2859 [11], тестируя от 1 до 5 процентов партии. Данный подход не гарантирует отсутствие скрытого брака у конкретной единицы продукции, что в сегменте систем пожарной безопасности несёт существенные репутационные и финансовые риски для конечных заказчиков (штрафные санкции МЧС за ложные срабатывания на социально значимых объектах классов Ф1.1 и Ф4.1). В противоположность этому, малосерийное производство объёмом до 700 изделий в месяц позволяет технически и экономически реализовать 100% автоматизированный выходной контроль каждой единицы продукции на стендах дымового и теплового каналов под управлением специализированной MES-системы.</w:t>
       </w:r>
     </w:p>
     <w:p>
@@ -5216,7 +5224,7 @@
           <w:sz w:val="28"/>
           <w:szCs w:val="28"/>
         </w:rPr>
-        <w:t>– прохождение обязательной сертификации продукции по ТР ЕАЭС 043/2017 «О требованиях к средствам обеспечения пожарной безопасности и пожаротушения» [11];</w:t>
+        <w:t>– прохождение обязательной сертификации продукции по ТР ЕАЭС 043/2017 «О требованиях к средствам обеспечения пожарной безопасности и пожаротушения» [6];</w:t>
       </w:r>
     </w:p>
     <w:p>
@@ -5814,7 +5822,7 @@
           <w:sz w:val="28"/>
           <w:szCs w:val="28"/>
         </w:rPr>
-        <w:t xml:space="preserve">[6] </w:t>
+        <w:t xml:space="preserve">[21] </w:t>
       </w:r>
       <w:r>
         <w:rPr>
@@ -5848,7 +5856,7 @@
           <w:sz w:val="28"/>
           <w:szCs w:val="28"/>
         </w:rPr>
-        <w:t>Строительный сектор остаётся фундаментальным драйвером спроса: в 2025 году введено 116,4 млн м² жилья (в том числе 62,1 млн м² ИЖС), а рекордные объёмы ввода коммерческой и складской недвижимости (~8 млн м² складов класса А/</w:t>
+        <w:t>Строительный сектор остаётся фундаментальным драйвером спроса: в 2025 году введено 116,4 [18] млн м² жилья (в том числе 62,1 млн м² ИЖС), а рекордные объёмы ввода коммерческой и складской недвижимости (~8 млн м² складов класса А/</w:t>
       </w:r>
       <w:r>
         <w:rPr>
@@ -5943,7 +5951,7 @@
           <w:sz w:val="28"/>
           <w:szCs w:val="28"/>
         </w:rPr>
-        <w:t>», общеобразовательные учреждения, объекты общественного питания, коттеджные посёлки). По оценкам аналитических агентств, в Российской Федерации действуют свыше 12 000 аккредитованных монтажных организаций с лицензией МЧС, из которых около 60% относятся к субъектам малого и среднего предпринимательства. Данные организации закупают комбинированные извещатели партиями от 50 до 500 штук под конкретные проектные задачи, проявляя высокую чувствительность к соотношению цены и технических характеристик оборудования.</w:t>
+        <w:t>», общеобразовательные учреждения, объекты общественного питания, коттеджные посёлки). По оценкам аналитических агентств, в Российской Федерации действуют свыше 12 000 аккредитованных [19; 22] монтажных организаций с лицензией МЧС, из которых около 60% относятся к субъектам малого и среднего предпринимательства [2]. Данные организации закупают комбинированные извещатели партиями от 50 до 500 штук под конкретные проектные задачи, проявляя высокую чувствительность к соотношению цены и технических характеристик оборудования.</w:t>
       </w:r>
     </w:p>
     <w:p>
@@ -8039,7 +8047,7 @@
           <w:sz w:val="28"/>
           <w:szCs w:val="28"/>
         </w:rPr>
-        <w:t xml:space="preserve">Прогноз годовой выручки на проектной мощности составляет 18,66 миллиона рублей, что находится ниже порогового значения 60 миллионов рублей, установленного Федеральным законом для применения упрощённой системы налогообложения без обязанности уплаты налога на добавленную стоимость (с 2025 года). Данное обстоятельство является принципиально важным преимуществом выбранного масштаба предприятия: его операционная деятельность попадает под льготный специальный налоговый режим, что снижает административную нагрузку и обеспечивает </w:t>
+        <w:t xml:space="preserve">Прогноз годовой выручки на проектной мощности составляет 18,66 миллиона рублей, что находится ниже порогового значения 60 миллионов рублей, установленного Федеральным законом для применения упрощённой системы налогообложения [4] без обязанности уплаты налога на добавленную стоимость (с 2025 года). Данное обстоятельство является принципиально важным преимуществом выбранного масштаба предприятия: его операционная деятельность попадает под льготный специальный налоговый режим, что снижает административную нагрузку и обеспечивает </w:t>
       </w:r>
       <w:r>
         <w:rPr>
@@ -10684,7 +10692,7 @@
           <w:sz w:val="28"/>
           <w:szCs w:val="28"/>
         </w:rPr>
-        <w:t>Итогом расчёта всех потоков становится чистый денежный поток — основной показатель для проведения дисконтирования и анализа эффективности проекта во времени. При составлении бизнес-плана эффективность проекта принято оценивать с помощью системы интегральных показателей, базирующихся на принципе временной стоимости денег (</w:t>
+        <w:t>Итогом расчёта всех потоков становится чистый денежный поток — основной показатель для проведения дисконтирования и анализа эффективности проекта во времени. При составлении бизнес-плана эффективность проекта принято оценивать с помощью системы интегральных показателей, базирующихся на принципе временной стоимости денег [15; 16] (</w:t>
       </w:r>
       <w:r>
         <w:rPr>
@@ -10846,7 +10854,7 @@
           <w:sz w:val="28"/>
           <w:szCs w:val="28"/>
         </w:rPr>
-        <w:t xml:space="preserve"> демонстрирует абсолютную величину приращения стоимости проекта в текущем моменте времени и определяется как сумма дисконтированных чистых денежных потоков за весь горизонт планирования за вычетом первоначальных инвестиционных затрат. Положительное значение </w:t>
+        <w:t xml:space="preserve"> демонстрирует абсолютную величину приращения стоимости проекта в текущем моменте времени и определяется как сумма дисконтированных чистых денежных потоков [15] за весь горизонт планирования за вычетом первоначальных инвестиционных затрат. Положительное значение </w:t>
       </w:r>
       <w:r>
         <w:rPr>
@@ -13946,7 +13954,7 @@
           <w:sz w:val="28"/>
           <w:szCs w:val="28"/>
         </w:rPr>
-        <w:t>Площадь 142,5 м² позволяет организовать технологическое зонирование с учётом требований ESD-защиты (ГОСТ IEC 61340-5-1-2019 [12]) и санитарных норм:</w:t>
+        <w:t>Площадь 142,5 м² позволяет организовать технологическое зонирование с учётом требований ESD-защиты (ГОСТ IEC 61340-5-1-2019 [9]) и санитарных норм:</w:t>
       </w:r>
     </w:p>
     <w:p>
@@ -17199,7 +17207,7 @@
                 <w:sz w:val="28"/>
                 <w:szCs w:val="28"/>
               </w:rPr>
-              <w:t>ЧИП и ДИП</w:t>
+              <w:t>ЧИП и ДИП [25]</w:t>
             </w:r>
           </w:p>
         </w:tc>
@@ -20463,7 +20471,7 @@
           <w:szCs w:val="28"/>
         </w:rPr>
         <w:lastRenderedPageBreak/>
-        <w:t>Этап 1. Входной контроль комплектующих (ВТК). Партии печатных плат с выполненным SMT-монтажом, поступающие от контрактного производителя ООО «Электроконнект», подвергаются обязательному визуальному и инструментальному контролю. Техник ОТК осуществляет выборочную проверку качества пайки SMD-компонентов под бинокулярным микроскопом (в соответствии с критериями приёмки IPC-A-610 [13] класс 2), а также инструментальную проверку электрических параметров мультиметром (целостность цепей питания, отсутствие коротких замыканий между шинами). Партии, не прошедшие входной контроль, возвращаются поставщику по рекламации. Пластиковые корпуса проверяются на отсутствие деформаций, сколов и целостность воздухозаборных щелей дымовой камеры.</w:t>
+        <w:t>Этап 1. Входной контроль комплектующих (ВТК). Партии печатных плат с выполненным SMT-монтажом, поступающие от контрактного производителя ООО «Электроконнект», подвергаются обязательному визуальному и инструментальному контролю. Техник ОТК осуществляет выборочную проверку качества пайки SMD-компонентов под бинокулярным микроскопом (в соответствии с критериями приёмки IPC-A-610 [10] класс 2), а также инструментальную проверку электрических параметров мультиметром (целостность цепей питания, отсутствие коротких замыканий между шинами). Партии, не прошедшие входной контроль, возвращаются поставщику по рекламации. Пластиковые корпуса проверяются на отсутствие деформаций, сколов и целостность воздухозаборных щелей дымовой камеры.</w:t>
       </w:r>
     </w:p>
     <w:p>
@@ -23367,6 +23375,19 @@
             </a:graphic>
           </wp:inline>
         </w:drawing>
+      </w:r>
+    </w:p>
+    <w:p>
+      <w:pPr>
+        <w:jc w:val="center"/>
+      </w:pPr>
+      <w:r>
+        <w:rPr>
+          <w:rFonts w:ascii="Liberation Serif" w:hAnsi="Liberation Serif" w:cs="Liberation Serif"/>
+          <w:sz w:val="28"/>
+          <w:szCs w:val="28"/>
+        </w:rPr>
+        <w:t>Рисунок 17.1 – Модуль «План персонала» (детализация)</w:t>
       </w:r>
     </w:p>
     <w:p>
@@ -26321,15 +26342,17 @@
   <w:docDefaults>
     <w:rPrDefault>
       <w:rPr>
-        <w:rFonts w:asciiTheme="minorHAnsi" w:eastAsiaTheme="minorHAnsi" w:hAnsiTheme="minorHAnsi" w:cstheme="minorBidi"/>
-        <w:sz w:val="22"/>
-        <w:szCs w:val="22"/>
+        <w:rFonts w:ascii="Liberation Serif" w:eastAsia="Liberation Serif" w:hAnsi="Liberation Serif" w:cs="Liberation Serif"/>
+        <w:sz w:val="28"/>
+        <w:szCs w:val="28"/>
         <w:lang w:val="ru-RU" w:eastAsia="en-US" w:bidi="ar-SA"/>
       </w:rPr>
     </w:rPrDefault>
     <w:pPrDefault>
       <w:pPr>
-        <w:spacing w:after="160" w:line="259" w:lineRule="auto"/>
+        <w:spacing w:after="0" w:line="360" w:lineRule="auto"/>
+        <w:jc w:val="both"/>
+        <w:ind w:firstLine="709"/>
       </w:pPr>
     </w:pPrDefault>
   </w:docDefaults>

</xml_diff>

<commit_message>
Fix: removed citations from title page, re-inserted after ВВЕДЕНИЕ
</commit_message>
<xml_diff>
--- a/ВКР_Воробьев.docx
+++ b/ВКР_Воробьев.docx
@@ -527,7 +527,7 @@
           <w:sz w:val="28"/>
           <w:szCs w:val="28"/>
         </w:rPr>
-        <w:t xml:space="preserve"> Автоматизация технологических [12] процессов и производств</w:t>
+        <w:t xml:space="preserve"> Автоматизация технологических процессов и производств</w:t>
       </w:r>
     </w:p>
     <w:p>
@@ -2969,7 +2969,7 @@
           <w:sz w:val="28"/>
           <w:szCs w:val="28"/>
         </w:rPr>
-        <w:t>Методология исследования включает расчётно-аналитический метод, методы сравнительного анализа, элементы сценарного моделирования, графический метод и приёмы бизнес-планирования. В качестве основного инструмента финансового моделирования применяется специализированный программный комплекс Project Expert 6 Holding. Информационная база включает нормативные правовые акты Российской Федерации в области пожарной безопасности [3], статистические материалы Росстата и Банка России, а также аналитические материалы Минпромторга России и Корпорации МСП.</w:t>
+        <w:t>Методология исследования включает расчётно-аналитический метод, методы сравнительного анализа, элементы сценарного моделирования, графический метод и приёмы бизнес-планирования. В качестве основного инструмента финансового моделирования применяется специализированный программный комплекс Project Expert 6 Holding. Информационная база включает нормативные правовые акты Российской Федерации в области пожарной безопасности, статистические материалы Росстата и Банка России, а также аналитические материалы Минпромторга России и Корпорации МСП.</w:t>
       </w:r>
     </w:p>
     <w:p>
@@ -4451,7 +4451,7 @@
           <w:sz w:val="28"/>
           <w:szCs w:val="28"/>
         </w:rPr>
-        <w:t>Актуальность темы исследования определяется совокупностью технологических, нормативных и макроэкономических факторов, формирующих беспрецедентные условия для создания новых производственных предприятий в сфере систем пожарной безопасности на территории Российской Федерации.</w:t>
+        <w:t>Актуальность темы исследования определяется совокупностью технологических, нормативных и макроэкономических факторов, формирующих беспрецедентные условия для создания новых производственных предприятий в сфере систем пожарной безопасности [3] на территории Российской Федерации.</w:t>
       </w:r>
     </w:p>
     <w:p>
@@ -25568,7 +25568,7 @@
           <w:sz w:val="28"/>
           <w:szCs w:val="28"/>
         </w:rPr>
-        <w:t>12. Об утверждении правил предоставления субсидий российским организациям на компенсацию части затрат на производство и реализацию пилотных партий средств производства и материалов: Постановление Правительства Российской Федерации от 17 февраля 2016 года № 109 (с изменениями от 2025 года). – Доступ из справочно-правовой системы «КонсультантПлюс». – Текст: электронный.</w:t>
+        <w:t>12. Об утверждении правил предоставления субсидий [12] российским организациям на компенсацию части затрат на производство и реализацию пилотных партий средств производства и материалов: Постановление Правительства Российской Федерации от 17 февраля 2016 года № 109 (с изменениями от 2025 года). – Доступ из справочно-правовой системы «КонсультантПлюс». – Текст: электронный.</w:t>
       </w:r>
     </w:p>
     <w:p>

</xml_diff>

<commit_message>
Fix pre-intro: single spacing, no indent per GOST for title/task/abstract/contents
</commit_message>
<xml_diff>
--- a/ВКР_Воробьев.docx
+++ b/ВКР_Воробьев.docx
@@ -5,7 +5,7 @@
     <w:p>
       <w:pPr>
         <w:pStyle w:val="MySubtitle"/>
-        <w:spacing w:line="240" w:lineRule="auto"/>
+        <w:spacing w:after="0" w:before="0" w:line="240" w:lineRule="auto"/>
         <w:rPr>
           <w:rFonts w:ascii="Liberation Serif" w:hAnsi="Liberation Serif"/>
           <w:sz w:val="24"/>
@@ -24,7 +24,7 @@
     <w:p>
       <w:pPr>
         <w:pStyle w:val="MySubtitle"/>
-        <w:spacing w:line="240" w:lineRule="auto"/>
+        <w:spacing w:after="0" w:before="0" w:line="240" w:lineRule="auto"/>
         <w:rPr>
           <w:rFonts w:ascii="Liberation Serif" w:hAnsi="Liberation Serif"/>
           <w:lang w:val="ru-RU"/>
@@ -42,7 +42,7 @@
     <w:p>
       <w:pPr>
         <w:pStyle w:val="MySubtitle"/>
-        <w:spacing w:line="240" w:lineRule="auto"/>
+        <w:spacing w:after="0" w:before="0" w:line="240" w:lineRule="auto"/>
         <w:rPr>
           <w:rFonts w:ascii="Liberation Serif" w:hAnsi="Liberation Serif"/>
           <w:lang w:val="ru-RU"/>
@@ -59,7 +59,7 @@
     <w:p>
       <w:pPr>
         <w:pStyle w:val="MySubtitle"/>
-        <w:spacing w:line="240" w:lineRule="auto"/>
+        <w:spacing w:after="0" w:before="0" w:line="240" w:lineRule="auto"/>
         <w:rPr>
           <w:rFonts w:ascii="Liberation Serif" w:hAnsi="Liberation Serif"/>
           <w:lang w:val="ru-RU"/>
@@ -76,7 +76,7 @@
     <w:p>
       <w:pPr>
         <w:pStyle w:val="MySubtitle"/>
-        <w:spacing w:line="240" w:lineRule="auto"/>
+        <w:spacing w:after="0" w:before="0" w:line="240" w:lineRule="auto"/>
         <w:rPr>
           <w:rFonts w:ascii="Liberation Serif" w:hAnsi="Liberation Serif"/>
           <w:lang w:val="ru-RU"/>
@@ -93,7 +93,7 @@
     <w:p>
       <w:pPr>
         <w:pStyle w:val="MySubtitle"/>
-        <w:spacing w:line="240" w:lineRule="auto"/>
+        <w:spacing w:after="0" w:before="0" w:line="240" w:lineRule="auto"/>
         <w:rPr>
           <w:rFonts w:ascii="Liberation Serif" w:hAnsi="Liberation Serif"/>
           <w:lang w:val="ru-RU"/>
@@ -110,7 +110,7 @@
     <w:p>
       <w:pPr>
         <w:pStyle w:val="MySubtitle"/>
-        <w:spacing w:line="240" w:lineRule="auto"/>
+        <w:spacing w:after="0" w:before="0" w:line="240" w:lineRule="auto"/>
         <w:rPr>
           <w:rFonts w:ascii="Liberation Serif" w:hAnsi="Liberation Serif"/>
           <w:lang w:val="ru-RU"/>
@@ -120,7 +120,7 @@
     <w:p>
       <w:pPr>
         <w:pStyle w:val="MySubtitle"/>
-        <w:spacing w:line="240" w:lineRule="auto"/>
+        <w:spacing w:after="0" w:before="0" w:line="240" w:lineRule="auto"/>
         <w:rPr>
           <w:rFonts w:ascii="Liberation Serif" w:hAnsi="Liberation Serif"/>
           <w:sz w:val="24"/>
@@ -130,7 +130,7 @@
     </w:p>
     <w:p>
       <w:pPr>
-        <w:spacing w:after="0" w:line="240" w:lineRule="auto"/>
+        <w:spacing w:after="0" w:before="0" w:line="240" w:lineRule="auto"/>
         <w:rPr>
           <w:rFonts w:ascii="Liberation Serif" w:hAnsi="Liberation Serif" w:cs="Liberation Serif"/>
           <w:sz w:val="28"/>
@@ -151,7 +151,7 @@
       <w:pPr>
         <w:pStyle w:val="130"/>
         <w:shd w:val="clear" w:color="auto" w:fill="auto"/>
-        <w:spacing w:before="0" w:after="0" w:line="240" w:lineRule="auto"/>
+        <w:spacing w:after="0" w:before="0" w:line="240" w:lineRule="auto"/>
         <w:rPr>
           <w:rFonts w:ascii="Liberation Serif" w:hAnsi="Liberation Serif" w:cs="Liberation Serif"/>
           <w:b w:val="0"/>
@@ -192,7 +192,7 @@
       <w:pPr>
         <w:pStyle w:val="130"/>
         <w:shd w:val="clear" w:color="auto" w:fill="auto"/>
-        <w:spacing w:before="0" w:after="0" w:line="240" w:lineRule="auto"/>
+        <w:spacing w:after="0" w:before="0" w:line="240" w:lineRule="auto"/>
         <w:rPr>
           <w:rFonts w:ascii="Liberation Serif" w:hAnsi="Liberation Serif" w:cs="Liberation Serif"/>
           <w:b w:val="0"/>
@@ -266,7 +266,7 @@
       <w:pPr>
         <w:pStyle w:val="130"/>
         <w:shd w:val="clear" w:color="auto" w:fill="auto"/>
-        <w:spacing w:before="0" w:after="0" w:line="240" w:lineRule="auto"/>
+        <w:spacing w:after="0" w:before="0" w:line="240" w:lineRule="auto"/>
         <w:rPr>
           <w:rFonts w:ascii="Liberation Serif" w:hAnsi="Liberation Serif" w:cs="Liberation Serif"/>
           <w:b w:val="0"/>
@@ -340,7 +340,7 @@
       <w:pPr>
         <w:pStyle w:val="130"/>
         <w:shd w:val="clear" w:color="auto" w:fill="auto"/>
-        <w:spacing w:before="0" w:after="0" w:line="240" w:lineRule="auto"/>
+        <w:spacing w:after="0" w:before="0" w:line="240" w:lineRule="auto"/>
         <w:rPr>
           <w:rFonts w:ascii="Liberation Serif" w:hAnsi="Liberation Serif" w:cs="Liberation Serif"/>
           <w:b w:val="0"/>
@@ -353,7 +353,7 @@
       <w:pPr>
         <w:pStyle w:val="130"/>
         <w:shd w:val="clear" w:color="auto" w:fill="auto"/>
-        <w:spacing w:before="0" w:after="0" w:line="240" w:lineRule="auto"/>
+        <w:spacing w:after="0" w:before="0" w:line="240" w:lineRule="auto"/>
         <w:rPr>
           <w:rFonts w:ascii="Liberation Serif" w:hAnsi="Liberation Serif" w:cs="Liberation Serif"/>
           <w:b w:val="0"/>
@@ -366,7 +366,7 @@
       <w:pPr>
         <w:pStyle w:val="130"/>
         <w:shd w:val="clear" w:color="auto" w:fill="auto"/>
-        <w:spacing w:before="0" w:after="0" w:line="240" w:lineRule="auto"/>
+        <w:spacing w:after="0" w:before="0" w:line="240" w:lineRule="auto"/>
         <w:rPr>
           <w:rFonts w:ascii="Liberation Serif" w:hAnsi="Liberation Serif" w:cs="Liberation Serif"/>
           <w:b w:val="0"/>
@@ -378,7 +378,7 @@
     <w:p>
       <w:pPr>
         <w:pStyle w:val="MyTitleCenter"/>
-        <w:spacing w:line="240" w:lineRule="auto"/>
+        <w:spacing w:after="0" w:before="0" w:line="240" w:lineRule="auto"/>
         <w:rPr>
           <w:rFonts w:ascii="Liberation Serif" w:hAnsi="Liberation Serif"/>
           <w:sz w:val="40"/>
@@ -398,7 +398,7 @@
     <w:p>
       <w:pPr>
         <w:pStyle w:val="MySubtitle"/>
-        <w:spacing w:line="240" w:lineRule="auto"/>
+        <w:spacing w:after="0" w:before="0" w:line="240" w:lineRule="auto"/>
         <w:rPr>
           <w:rFonts w:ascii="Liberation Serif" w:hAnsi="Liberation Serif"/>
           <w:b/>
@@ -420,7 +420,7 @@
     <w:p>
       <w:pPr>
         <w:pStyle w:val="MySubtitle"/>
-        <w:spacing w:line="240" w:lineRule="auto"/>
+        <w:spacing w:after="0" w:before="0" w:line="240" w:lineRule="auto"/>
         <w:rPr>
           <w:rFonts w:ascii="Liberation Serif" w:hAnsi="Liberation Serif"/>
           <w:sz w:val="36"/>
@@ -440,7 +440,7 @@
     <w:p>
       <w:pPr>
         <w:pStyle w:val="MySubtitle"/>
-        <w:spacing w:line="240" w:lineRule="auto"/>
+        <w:spacing w:after="0" w:before="0" w:line="240" w:lineRule="auto"/>
         <w:rPr>
           <w:rFonts w:ascii="Liberation Serif" w:hAnsi="Liberation Serif"/>
           <w:sz w:val="16"/>
@@ -451,7 +451,7 @@
     <w:p>
       <w:pPr>
         <w:pStyle w:val="MyTitleCenter"/>
-        <w:spacing w:line="240" w:lineRule="auto"/>
+        <w:spacing w:after="0" w:before="0" w:line="240" w:lineRule="auto"/>
         <w:rPr>
           <w:rFonts w:ascii="Liberation Serif" w:hAnsi="Liberation Serif"/>
           <w:sz w:val="32"/>
@@ -470,7 +470,7 @@
     </w:p>
     <w:p>
       <w:pPr>
-        <w:spacing w:after="0" w:line="240" w:lineRule="auto"/>
+        <w:spacing w:after="0" w:before="0" w:line="240" w:lineRule="auto"/>
         <w:rPr>
           <w:rFonts w:ascii="Liberation Serif" w:hAnsi="Liberation Serif" w:cs="Times New Roman"/>
           <w:b/>
@@ -480,7 +480,7 @@
     </w:p>
     <w:p>
       <w:pPr>
-        <w:spacing w:after="0" w:line="240" w:lineRule="auto"/>
+        <w:spacing w:after="0" w:before="0" w:line="240" w:lineRule="auto"/>
         <w:rPr>
           <w:rFonts w:ascii="Liberation Serif" w:hAnsi="Liberation Serif" w:cs="Times New Roman"/>
           <w:b/>
@@ -490,7 +490,7 @@
     </w:p>
     <w:p>
       <w:pPr>
-        <w:spacing w:after="0" w:line="240" w:lineRule="auto"/>
+        <w:spacing w:after="0" w:before="0" w:line="240" w:lineRule="auto"/>
         <w:rPr>
           <w:rFonts w:ascii="Liberation Serif" w:hAnsi="Liberation Serif" w:cs="Liberation Serif"/>
           <w:sz w:val="28"/>
@@ -532,7 +532,7 @@
     </w:p>
     <w:p>
       <w:pPr>
-        <w:spacing w:after="0" w:line="240" w:lineRule="auto"/>
+        <w:spacing w:after="0" w:before="0" w:line="240" w:lineRule="auto"/>
         <w:rPr>
           <w:rFonts w:ascii="Liberation Serif" w:hAnsi="Liberation Serif" w:cs="Liberation Serif"/>
           <w:sz w:val="28"/>
@@ -542,7 +542,7 @@
     </w:p>
     <w:p>
       <w:pPr>
-        <w:spacing w:after="0" w:line="240" w:lineRule="auto"/>
+        <w:spacing w:after="0" w:before="0" w:line="240" w:lineRule="auto"/>
         <w:rPr>
           <w:rFonts w:ascii="Liberation Serif" w:hAnsi="Liberation Serif" w:cs="Liberation Serif"/>
           <w:sz w:val="28"/>
@@ -552,7 +552,7 @@
     </w:p>
     <w:p>
       <w:pPr>
-        <w:spacing w:after="0" w:line="240" w:lineRule="auto"/>
+        <w:spacing w:after="0" w:before="0" w:line="240" w:lineRule="auto"/>
         <w:rPr>
           <w:rFonts w:ascii="Liberation Serif" w:hAnsi="Liberation Serif" w:cs="Liberation Serif"/>
           <w:sz w:val="28"/>
@@ -579,7 +579,7 @@
     </w:p>
     <w:p>
       <w:pPr>
-        <w:spacing w:after="0" w:line="240" w:lineRule="auto"/>
+        <w:spacing w:after="0" w:before="0" w:line="240" w:lineRule="auto"/>
         <w:rPr>
           <w:rFonts w:ascii="Liberation Serif" w:hAnsi="Liberation Serif" w:cs="Liberation Serif"/>
           <w:sz w:val="28"/>
@@ -589,7 +589,7 @@
     </w:p>
     <w:p>
       <w:pPr>
-        <w:spacing w:after="0" w:line="240" w:lineRule="auto"/>
+        <w:spacing w:after="0" w:before="0" w:line="240" w:lineRule="auto"/>
         <w:rPr>
           <w:rFonts w:ascii="Liberation Serif" w:hAnsi="Liberation Serif" w:cs="Liberation Serif"/>
           <w:sz w:val="28"/>
@@ -599,7 +599,7 @@
     </w:p>
     <w:p>
       <w:pPr>
-        <w:spacing w:after="0" w:line="240" w:lineRule="auto"/>
+        <w:spacing w:after="0" w:before="0" w:line="240" w:lineRule="auto"/>
         <w:rPr>
           <w:rFonts w:ascii="Liberation Serif" w:hAnsi="Liberation Serif" w:cs="Liberation Serif"/>
           <w:sz w:val="28"/>
@@ -609,7 +609,7 @@
     </w:p>
     <w:p>
       <w:pPr>
-        <w:spacing w:after="0" w:line="240" w:lineRule="auto"/>
+        <w:spacing w:after="0" w:before="0" w:line="240" w:lineRule="auto"/>
         <w:rPr>
           <w:rFonts w:ascii="Liberation Serif" w:hAnsi="Liberation Serif" w:cs="Liberation Serif"/>
           <w:sz w:val="28"/>
@@ -619,7 +619,7 @@
     </w:p>
     <w:p>
       <w:pPr>
-        <w:spacing w:after="0" w:line="240" w:lineRule="auto"/>
+        <w:spacing w:after="0" w:before="0" w:line="240" w:lineRule="auto"/>
         <w:rPr>
           <w:rFonts w:ascii="Liberation Serif" w:hAnsi="Liberation Serif" w:cs="Liberation Serif"/>
           <w:sz w:val="28"/>
@@ -629,7 +629,7 @@
     </w:p>
     <w:p>
       <w:pPr>
-        <w:spacing w:after="0" w:line="240" w:lineRule="auto"/>
+        <w:spacing w:after="0" w:before="0" w:line="240" w:lineRule="auto"/>
         <w:rPr>
           <w:rFonts w:ascii="Liberation Serif" w:hAnsi="Liberation Serif" w:cs="Liberation Serif"/>
           <w:sz w:val="28"/>
@@ -718,7 +718,7 @@
     </w:p>
     <w:p>
       <w:pPr>
-        <w:spacing w:after="0" w:line="240" w:lineRule="auto"/>
+        <w:spacing w:after="0" w:before="0" w:line="240" w:lineRule="auto"/>
         <w:rPr>
           <w:rFonts w:ascii="Liberation Serif" w:hAnsi="Liberation Serif" w:cs="Liberation Serif"/>
           <w:sz w:val="28"/>
@@ -728,7 +728,7 @@
     </w:p>
     <w:p>
       <w:pPr>
-        <w:spacing w:after="0" w:line="240" w:lineRule="auto"/>
+        <w:spacing w:after="0" w:before="0" w:line="240" w:lineRule="auto"/>
         <w:rPr>
           <w:rFonts w:ascii="Liberation Serif" w:hAnsi="Liberation Serif" w:cs="Liberation Serif"/>
           <w:sz w:val="28"/>
@@ -796,7 +796,7 @@
     </w:p>
     <w:p>
       <w:pPr>
-        <w:spacing w:after="0" w:line="240" w:lineRule="auto"/>
+        <w:spacing w:after="0" w:before="0" w:line="240" w:lineRule="auto"/>
         <w:rPr>
           <w:rFonts w:ascii="Liberation Serif" w:hAnsi="Liberation Serif" w:cs="Liberation Serif"/>
           <w:sz w:val="28"/>
@@ -806,7 +806,7 @@
     </w:p>
     <w:p>
       <w:pPr>
-        <w:spacing w:after="0" w:line="240" w:lineRule="auto"/>
+        <w:spacing w:after="0" w:before="0" w:line="240" w:lineRule="auto"/>
         <w:rPr>
           <w:rFonts w:ascii="Liberation Serif" w:hAnsi="Liberation Serif" w:cs="Liberation Serif"/>
           <w:sz w:val="28"/>
@@ -888,7 +888,7 @@
     </w:p>
     <w:p>
       <w:pPr>
-        <w:spacing w:after="0" w:line="240" w:lineRule="auto"/>
+        <w:spacing w:after="0" w:before="0" w:line="240" w:lineRule="auto"/>
         <w:rPr>
           <w:rFonts w:ascii="Liberation Serif" w:hAnsi="Liberation Serif" w:cs="Liberation Serif"/>
           <w:sz w:val="28"/>
@@ -899,7 +899,7 @@
     </w:p>
     <w:p>
       <w:pPr>
-        <w:spacing w:after="0" w:line="240" w:lineRule="auto"/>
+        <w:spacing w:after="0" w:before="0" w:line="240" w:lineRule="auto"/>
         <w:jc w:val="center"/>
         <w:rPr>
           <w:rFonts w:ascii="Liberation Serif" w:hAnsi="Liberation Serif" w:cs="Liberation Serif"/>
@@ -910,7 +910,7 @@
     </w:p>
     <w:p>
       <w:pPr>
-        <w:spacing w:after="0" w:line="240" w:lineRule="auto"/>
+        <w:spacing w:after="0" w:before="0" w:line="240" w:lineRule="auto"/>
         <w:rPr>
           <w:rFonts w:ascii="Liberation Serif" w:hAnsi="Liberation Serif" w:cs="Liberation Serif"/>
           <w:sz w:val="28"/>
@@ -920,7 +920,7 @@
     </w:p>
     <w:p>
       <w:pPr>
-        <w:spacing w:after="0" w:line="240" w:lineRule="auto"/>
+        <w:spacing w:after="0" w:before="0" w:line="240" w:lineRule="auto"/>
         <w:jc w:val="center"/>
         <w:rPr>
           <w:rFonts w:ascii="Liberation Serif" w:hAnsi="Liberation Serif" w:cs="Liberation Serif"/>
@@ -956,7 +956,7 @@
     </w:p>
     <w:p>
       <w:pPr>
-        <w:spacing w:after="0" w:line="240" w:lineRule="auto"/>
+        <w:spacing w:after="0" w:before="0" w:line="240" w:lineRule="auto"/>
         <w:jc w:val="center"/>
         <w:rPr>
           <w:rFonts w:ascii="Liberation Serif" w:hAnsi="Liberation Serif" w:cs="Liberation Serif"/>
@@ -967,7 +967,7 @@
     <w:p>
       <w:pPr>
         <w:pStyle w:val="MySubtitle"/>
-        <w:spacing w:line="240" w:lineRule="auto"/>
+        <w:spacing w:after="0" w:before="0" w:line="240" w:lineRule="auto"/>
         <w:rPr>
           <w:rFonts w:ascii="Liberation Serif" w:hAnsi="Liberation Serif"/>
           <w:sz w:val="24"/>
@@ -986,7 +986,7 @@
     <w:p>
       <w:pPr>
         <w:pStyle w:val="MySubtitle"/>
-        <w:spacing w:line="240" w:lineRule="auto"/>
+        <w:spacing w:after="0" w:before="0" w:line="240" w:lineRule="auto"/>
         <w:rPr>
           <w:rFonts w:ascii="Liberation Serif" w:hAnsi="Liberation Serif"/>
           <w:lang w:val="ru-RU"/>
@@ -1004,7 +1004,7 @@
     <w:p>
       <w:pPr>
         <w:pStyle w:val="MySubtitle"/>
-        <w:spacing w:line="240" w:lineRule="auto"/>
+        <w:spacing w:after="0" w:before="0" w:line="240" w:lineRule="auto"/>
         <w:rPr>
           <w:rFonts w:ascii="Liberation Serif" w:hAnsi="Liberation Serif"/>
           <w:lang w:val="ru-RU"/>
@@ -1021,7 +1021,7 @@
     <w:p>
       <w:pPr>
         <w:pStyle w:val="MySubtitle"/>
-        <w:spacing w:line="240" w:lineRule="auto"/>
+        <w:spacing w:after="0" w:before="0" w:line="240" w:lineRule="auto"/>
         <w:rPr>
           <w:rFonts w:ascii="Liberation Serif" w:hAnsi="Liberation Serif"/>
           <w:lang w:val="ru-RU"/>
@@ -1038,7 +1038,7 @@
     <w:p>
       <w:pPr>
         <w:pStyle w:val="MySubtitle"/>
-        <w:spacing w:line="240" w:lineRule="auto"/>
+        <w:spacing w:after="0" w:before="0" w:line="240" w:lineRule="auto"/>
         <w:rPr>
           <w:rFonts w:ascii="Liberation Serif" w:hAnsi="Liberation Serif"/>
           <w:lang w:val="ru-RU"/>
@@ -1055,7 +1055,7 @@
     <w:p>
       <w:pPr>
         <w:pStyle w:val="MySubtitle"/>
-        <w:spacing w:line="240" w:lineRule="auto"/>
+        <w:spacing w:after="0" w:before="0" w:line="240" w:lineRule="auto"/>
         <w:rPr>
           <w:rFonts w:ascii="Liberation Serif" w:hAnsi="Liberation Serif"/>
           <w:lang w:val="ru-RU"/>
@@ -1072,7 +1072,7 @@
     <w:p>
       <w:pPr>
         <w:pStyle w:val="MySubtitle"/>
-        <w:spacing w:line="240" w:lineRule="auto"/>
+        <w:spacing w:after="0" w:before="0" w:line="240" w:lineRule="auto"/>
         <w:rPr>
           <w:rFonts w:ascii="Liberation Serif" w:hAnsi="Liberation Serif"/>
           <w:sz w:val="24"/>
@@ -1082,7 +1082,7 @@
     </w:p>
     <w:p>
       <w:pPr>
-        <w:spacing w:after="0" w:line="240" w:lineRule="auto"/>
+        <w:spacing w:after="0" w:before="0" w:line="240" w:lineRule="auto"/>
         <w:rPr>
           <w:rFonts w:ascii="Liberation Serif" w:hAnsi="Liberation Serif" w:cs="Liberation Serif"/>
           <w:sz w:val="28"/>
@@ -1118,7 +1118,7 @@
       <w:pPr>
         <w:pStyle w:val="130"/>
         <w:shd w:val="clear" w:color="auto" w:fill="auto"/>
-        <w:spacing w:before="0" w:after="0" w:line="240" w:lineRule="auto"/>
+        <w:spacing w:after="0" w:before="0" w:line="240" w:lineRule="auto"/>
         <w:rPr>
           <w:rFonts w:ascii="Liberation Serif" w:hAnsi="Liberation Serif" w:cs="Liberation Serif"/>
           <w:b w:val="0"/>
@@ -1158,7 +1158,7 @@
       <w:pPr>
         <w:pStyle w:val="130"/>
         <w:shd w:val="clear" w:color="auto" w:fill="auto"/>
-        <w:spacing w:before="0" w:after="0" w:line="240" w:lineRule="auto"/>
+        <w:spacing w:after="0" w:before="0" w:line="240" w:lineRule="auto"/>
         <w:rPr>
           <w:rFonts w:ascii="Liberation Serif" w:hAnsi="Liberation Serif" w:cs="Liberation Serif"/>
           <w:b w:val="0"/>
@@ -1231,7 +1231,7 @@
       <w:pPr>
         <w:pStyle w:val="130"/>
         <w:shd w:val="clear" w:color="auto" w:fill="auto"/>
-        <w:spacing w:before="0" w:after="0" w:line="240" w:lineRule="auto"/>
+        <w:spacing w:after="0" w:before="0" w:line="240" w:lineRule="auto"/>
         <w:rPr>
           <w:rFonts w:ascii="Liberation Serif" w:hAnsi="Liberation Serif" w:cs="Liberation Serif"/>
           <w:b w:val="0"/>
@@ -1321,7 +1321,7 @@
       <w:pPr>
         <w:pStyle w:val="130"/>
         <w:shd w:val="clear" w:color="auto" w:fill="auto"/>
-        <w:spacing w:before="0" w:after="0" w:line="240" w:lineRule="auto"/>
+        <w:spacing w:after="0" w:before="0" w:line="240" w:lineRule="auto"/>
         <w:rPr>
           <w:rFonts w:ascii="Liberation Serif" w:hAnsi="Liberation Serif" w:cs="Liberation Serif"/>
           <w:b w:val="0"/>
@@ -1334,7 +1334,7 @@
       <w:pPr>
         <w:pStyle w:val="130"/>
         <w:shd w:val="clear" w:color="auto" w:fill="auto"/>
-        <w:spacing w:before="0" w:after="0" w:line="240" w:lineRule="auto"/>
+        <w:spacing w:after="0" w:before="0" w:line="240" w:lineRule="auto"/>
         <w:rPr>
           <w:rFonts w:ascii="Liberation Serif" w:hAnsi="Liberation Serif" w:cs="Liberation Serif"/>
           <w:b w:val="0"/>
@@ -1349,7 +1349,7 @@
         <w:keepNext/>
         <w:keepLines/>
         <w:shd w:val="clear" w:color="auto" w:fill="auto"/>
-        <w:spacing w:before="0" w:after="0" w:line="240" w:lineRule="auto"/>
+        <w:spacing w:after="0" w:before="0" w:line="240" w:lineRule="auto"/>
         <w:outlineLvl w:val="9"/>
         <w:rPr>
           <w:rFonts w:ascii="Liberation Serif" w:hAnsi="Liberation Serif" w:cs="Liberation Serif"/>
@@ -1370,8 +1370,7 @@
       <w:pPr>
         <w:pStyle w:val="11"/>
         <w:shd w:val="clear" w:color="auto" w:fill="auto"/>
-        <w:spacing w:before="0" w:line="240" w:lineRule="auto"/>
-        <w:ind w:firstLine="0"/>
+        <w:spacing w:after="0" w:before="0" w:line="240" w:lineRule="auto"/>
         <w:rPr>
           <w:rFonts w:ascii="Liberation Serif" w:hAnsi="Liberation Serif" w:cs="Liberation Serif"/>
           <w:sz w:val="28"/>
@@ -1391,8 +1390,7 @@
       <w:pPr>
         <w:pStyle w:val="11"/>
         <w:shd w:val="clear" w:color="auto" w:fill="auto"/>
-        <w:spacing w:before="0" w:line="240" w:lineRule="auto"/>
-        <w:ind w:firstLine="0"/>
+        <w:spacing w:after="0" w:before="0" w:line="240" w:lineRule="auto"/>
         <w:rPr>
           <w:rFonts w:ascii="Liberation Serif" w:hAnsi="Liberation Serif" w:cs="Liberation Serif"/>
           <w:sz w:val="28"/>
@@ -1412,8 +1410,7 @@
       <w:pPr>
         <w:pStyle w:val="11"/>
         <w:shd w:val="clear" w:color="auto" w:fill="auto"/>
-        <w:spacing w:before="0" w:line="240" w:lineRule="auto"/>
-        <w:ind w:firstLine="0"/>
+        <w:spacing w:after="0" w:before="0" w:line="240" w:lineRule="auto"/>
         <w:rPr>
           <w:rFonts w:ascii="Liberation Serif" w:hAnsi="Liberation Serif" w:cs="Liberation Serif"/>
           <w:sz w:val="28"/>
@@ -1428,7 +1425,7 @@
         <w:tabs>
           <w:tab w:val="left" w:pos="9639"/>
         </w:tabs>
-        <w:spacing w:before="0" w:after="0" w:line="240" w:lineRule="auto"/>
+        <w:spacing w:after="0" w:before="0" w:line="240" w:lineRule="auto"/>
         <w:rPr>
           <w:rFonts w:ascii="Liberation Serif" w:hAnsi="Liberation Serif"/>
           <w:sz w:val="28"/>
@@ -1451,7 +1448,7 @@
         <w:tabs>
           <w:tab w:val="left" w:pos="9639"/>
         </w:tabs>
-        <w:spacing w:before="0" w:after="0" w:line="240" w:lineRule="auto"/>
+        <w:spacing w:after="0" w:before="0" w:line="240" w:lineRule="auto"/>
         <w:jc w:val="both"/>
         <w:rPr>
           <w:rFonts w:ascii="Liberation Serif" w:hAnsi="Liberation Serif"/>
@@ -1467,7 +1464,7 @@
         <w:tabs>
           <w:tab w:val="left" w:pos="9639"/>
         </w:tabs>
-        <w:spacing w:before="0" w:after="0" w:line="240" w:lineRule="auto"/>
+        <w:spacing w:after="0" w:before="0" w:line="240" w:lineRule="auto"/>
         <w:rPr>
           <w:rFonts w:ascii="Liberation Serif" w:hAnsi="Liberation Serif"/>
           <w:sz w:val="28"/>
@@ -1490,7 +1487,7 @@
         <w:tabs>
           <w:tab w:val="left" w:pos="9639"/>
         </w:tabs>
-        <w:spacing w:before="0" w:after="0" w:line="240" w:lineRule="auto"/>
+        <w:spacing w:after="0" w:before="0" w:line="240" w:lineRule="auto"/>
         <w:rPr>
           <w:rFonts w:ascii="Liberation Serif" w:hAnsi="Liberation Serif"/>
           <w:sz w:val="28"/>
@@ -1505,7 +1502,7 @@
         <w:tabs>
           <w:tab w:val="left" w:pos="9639"/>
         </w:tabs>
-        <w:spacing w:before="0" w:after="0" w:line="240" w:lineRule="auto"/>
+        <w:spacing w:after="0" w:before="0" w:line="240" w:lineRule="auto"/>
         <w:rPr>
           <w:rFonts w:ascii="Liberation Serif" w:hAnsi="Liberation Serif" w:cs="Liberation Serif"/>
           <w:sz w:val="28"/>
@@ -1582,7 +1579,7 @@
         <w:tabs>
           <w:tab w:val="left" w:pos="9639"/>
         </w:tabs>
-        <w:spacing w:before="0" w:after="0" w:line="240" w:lineRule="auto"/>
+        <w:spacing w:after="0" w:before="0" w:line="240" w:lineRule="auto"/>
         <w:rPr>
           <w:rFonts w:ascii="Liberation Serif" w:hAnsi="Liberation Serif"/>
           <w:sz w:val="28"/>
@@ -1605,7 +1602,7 @@
         <w:tabs>
           <w:tab w:val="left" w:pos="9639"/>
         </w:tabs>
-        <w:spacing w:before="0" w:after="0" w:line="240" w:lineRule="auto"/>
+        <w:spacing w:after="0" w:before="0" w:line="240" w:lineRule="auto"/>
         <w:rPr>
           <w:rFonts w:ascii="Liberation Serif" w:hAnsi="Liberation Serif"/>
           <w:sz w:val="28"/>
@@ -1660,7 +1657,7 @@
         <w:tabs>
           <w:tab w:val="left" w:pos="9639"/>
         </w:tabs>
-        <w:spacing w:before="0" w:after="0" w:line="240" w:lineRule="auto"/>
+        <w:spacing w:after="0" w:before="0" w:line="240" w:lineRule="auto"/>
         <w:rPr>
           <w:rFonts w:ascii="Liberation Serif" w:hAnsi="Liberation Serif"/>
           <w:sz w:val="28"/>
@@ -1670,7 +1667,7 @@
     </w:p>
     <w:p>
       <w:pPr>
-        <w:spacing w:after="0" w:line="240" w:lineRule="auto"/>
+        <w:spacing w:after="0" w:before="0" w:line="240" w:lineRule="auto"/>
         <w:jc w:val="both"/>
         <w:rPr>
           <w:rFonts w:ascii="Liberation Serif" w:hAnsi="Liberation Serif"/>
@@ -1695,7 +1692,7 @@
       <w:pPr>
         <w:pStyle w:val="ds-markdown-paragraph"/>
         <w:shd w:val="clear" w:color="auto" w:fill="FFFFFF"/>
-        <w:spacing w:before="0" w:beforeAutospacing="0" w:after="0" w:afterAutospacing="0"/>
+        <w:spacing w:after="0" w:before="0" w:line="240" w:lineRule="auto"/>
         <w:jc w:val="both"/>
         <w:rPr>
           <w:rFonts w:ascii="Liberation Serif" w:hAnsi="Liberation Serif"/>
@@ -1719,7 +1716,7 @@
         <w:tabs>
           <w:tab w:val="left" w:pos="9639"/>
         </w:tabs>
-        <w:spacing w:before="0" w:after="0" w:line="240" w:lineRule="auto"/>
+        <w:spacing w:after="0" w:before="0" w:line="240" w:lineRule="auto"/>
         <w:rPr>
           <w:rFonts w:ascii="Liberation Serif" w:hAnsi="Liberation Serif"/>
           <w:sz w:val="28"/>
@@ -1735,7 +1732,7 @@
         <w:tabs>
           <w:tab w:val="left" w:pos="9639"/>
         </w:tabs>
-        <w:spacing w:before="0" w:after="0" w:line="240" w:lineRule="auto"/>
+        <w:spacing w:after="0" w:before="0" w:line="240" w:lineRule="auto"/>
         <w:rPr>
           <w:rFonts w:ascii="Liberation Serif" w:hAnsi="Liberation Serif"/>
           <w:sz w:val="28"/>
@@ -1758,7 +1755,7 @@
         <w:tabs>
           <w:tab w:val="left" w:pos="9639"/>
         </w:tabs>
-        <w:spacing w:before="0" w:after="0" w:line="240" w:lineRule="auto"/>
+        <w:spacing w:after="0" w:before="0" w:line="240" w:lineRule="auto"/>
         <w:jc w:val="left"/>
         <w:rPr>
           <w:rFonts w:ascii="Liberation Serif" w:hAnsi="Liberation Serif"/>
@@ -1779,7 +1776,7 @@
       <w:pPr>
         <w:pStyle w:val="ds-markdown-paragraph"/>
         <w:shd w:val="clear" w:color="auto" w:fill="FFFFFF"/>
-        <w:spacing w:before="0" w:beforeAutospacing="0" w:after="0" w:afterAutospacing="0"/>
+        <w:spacing w:after="0" w:before="0" w:line="240" w:lineRule="auto"/>
         <w:rPr>
           <w:rFonts w:ascii="Liberation Serif" w:hAnsi="Liberation Serif"/>
           <w:sz w:val="28"/>
@@ -1801,7 +1798,7 @@
       <w:pPr>
         <w:pStyle w:val="ds-markdown-paragraph"/>
         <w:shd w:val="clear" w:color="auto" w:fill="FFFFFF"/>
-        <w:spacing w:before="0" w:beforeAutospacing="0" w:after="0" w:afterAutospacing="0"/>
+        <w:spacing w:after="0" w:before="0" w:line="240" w:lineRule="auto"/>
         <w:rPr>
           <w:rFonts w:ascii="Liberation Serif" w:hAnsi="Liberation Serif"/>
           <w:sz w:val="28"/>
@@ -1821,7 +1818,7 @@
       <w:pPr>
         <w:pStyle w:val="ds-markdown-paragraph"/>
         <w:shd w:val="clear" w:color="auto" w:fill="FFFFFF"/>
-        <w:spacing w:before="0" w:beforeAutospacing="0" w:after="0" w:afterAutospacing="0"/>
+        <w:spacing w:after="0" w:before="0" w:line="240" w:lineRule="auto"/>
         <w:rPr>
           <w:rFonts w:ascii="Liberation Serif" w:hAnsi="Liberation Serif"/>
           <w:sz w:val="28"/>
@@ -1841,7 +1838,7 @@
       <w:pPr>
         <w:pStyle w:val="ds-markdown-paragraph"/>
         <w:shd w:val="clear" w:color="auto" w:fill="FFFFFF"/>
-        <w:spacing w:before="0" w:beforeAutospacing="0" w:after="0" w:afterAutospacing="0"/>
+        <w:spacing w:after="0" w:before="0" w:line="240" w:lineRule="auto"/>
         <w:rPr>
           <w:rFonts w:ascii="Liberation Serif" w:hAnsi="Liberation Serif"/>
           <w:sz w:val="28"/>
@@ -1861,7 +1858,7 @@
       <w:pPr>
         <w:pStyle w:val="ds-markdown-paragraph"/>
         <w:shd w:val="clear" w:color="auto" w:fill="FFFFFF"/>
-        <w:spacing w:before="0" w:beforeAutospacing="0" w:after="0" w:afterAutospacing="0"/>
+        <w:spacing w:after="0" w:before="0" w:line="240" w:lineRule="auto"/>
         <w:rPr>
           <w:rFonts w:ascii="Liberation Serif" w:hAnsi="Liberation Serif"/>
           <w:sz w:val="28"/>
@@ -1883,7 +1880,7 @@
       <w:pPr>
         <w:pStyle w:val="ds-markdown-paragraph"/>
         <w:shd w:val="clear" w:color="auto" w:fill="FFFFFF"/>
-        <w:spacing w:before="0" w:beforeAutospacing="0" w:after="0" w:afterAutospacing="0"/>
+        <w:spacing w:after="0" w:before="0" w:line="240" w:lineRule="auto"/>
         <w:rPr>
           <w:rFonts w:ascii="Liberation Serif" w:hAnsi="Liberation Serif"/>
           <w:sz w:val="28"/>
@@ -1905,7 +1902,7 @@
       <w:pPr>
         <w:pStyle w:val="ds-markdown-paragraph"/>
         <w:shd w:val="clear" w:color="auto" w:fill="FFFFFF"/>
-        <w:spacing w:before="0" w:beforeAutospacing="0" w:after="0" w:afterAutospacing="0"/>
+        <w:spacing w:after="0" w:before="0" w:line="240" w:lineRule="auto"/>
         <w:rPr>
           <w:rFonts w:ascii="Liberation Serif" w:hAnsi="Liberation Serif"/>
           <w:sz w:val="28"/>
@@ -1925,7 +1922,7 @@
       <w:pPr>
         <w:pStyle w:val="ds-markdown-paragraph"/>
         <w:shd w:val="clear" w:color="auto" w:fill="FFFFFF"/>
-        <w:spacing w:before="0" w:beforeAutospacing="0" w:after="0" w:afterAutospacing="0"/>
+        <w:spacing w:after="0" w:before="0" w:line="240" w:lineRule="auto"/>
         <w:rPr>
           <w:rFonts w:ascii="Liberation Serif" w:hAnsi="Liberation Serif"/>
           <w:sz w:val="28"/>
@@ -1945,7 +1942,7 @@
       <w:pPr>
         <w:pStyle w:val="ds-markdown-paragraph"/>
         <w:shd w:val="clear" w:color="auto" w:fill="FFFFFF"/>
-        <w:spacing w:before="0" w:beforeAutospacing="0" w:after="0" w:afterAutospacing="0"/>
+        <w:spacing w:after="0" w:before="0" w:line="240" w:lineRule="auto"/>
         <w:rPr>
           <w:rFonts w:ascii="Liberation Serif" w:hAnsi="Liberation Serif"/>
           <w:sz w:val="28"/>
@@ -1966,7 +1963,7 @@
       <w:pPr>
         <w:pStyle w:val="ds-markdown-paragraph"/>
         <w:shd w:val="clear" w:color="auto" w:fill="FFFFFF"/>
-        <w:spacing w:before="0" w:beforeAutospacing="0" w:after="0" w:afterAutospacing="0"/>
+        <w:spacing w:after="0" w:before="0" w:line="240" w:lineRule="auto"/>
         <w:rPr>
           <w:rFonts w:ascii="Liberation Serif" w:hAnsi="Liberation Serif"/>
           <w:sz w:val="28"/>
@@ -1986,7 +1983,7 @@
       <w:pPr>
         <w:pStyle w:val="ds-markdown-paragraph"/>
         <w:shd w:val="clear" w:color="auto" w:fill="FFFFFF"/>
-        <w:spacing w:before="0" w:beforeAutospacing="0" w:after="0" w:afterAutospacing="0"/>
+        <w:spacing w:after="0" w:before="0" w:line="240" w:lineRule="auto"/>
         <w:rPr>
           <w:rFonts w:ascii="Liberation Serif" w:hAnsi="Liberation Serif"/>
           <w:sz w:val="28"/>
@@ -2006,7 +2003,7 @@
       <w:pPr>
         <w:pStyle w:val="ds-markdown-paragraph"/>
         <w:shd w:val="clear" w:color="auto" w:fill="FFFFFF"/>
-        <w:spacing w:before="0" w:beforeAutospacing="0" w:after="0" w:afterAutospacing="0"/>
+        <w:spacing w:after="0" w:before="0" w:line="240" w:lineRule="auto"/>
         <w:rPr>
           <w:rFonts w:ascii="Liberation Serif" w:hAnsi="Liberation Serif"/>
           <w:sz w:val="28"/>
@@ -2031,7 +2028,7 @@
         <w:tabs>
           <w:tab w:val="left" w:pos="9639"/>
         </w:tabs>
-        <w:spacing w:before="0" w:after="0" w:line="240" w:lineRule="auto"/>
+        <w:spacing w:after="0" w:before="0" w:line="240" w:lineRule="auto"/>
         <w:jc w:val="left"/>
         <w:rPr>
           <w:rFonts w:ascii="Liberation Serif" w:hAnsi="Liberation Serif"/>
@@ -2055,7 +2052,7 @@
         <w:tabs>
           <w:tab w:val="left" w:pos="9639"/>
         </w:tabs>
-        <w:spacing w:before="0" w:after="0" w:line="240" w:lineRule="auto"/>
+        <w:spacing w:after="0" w:before="0" w:line="240" w:lineRule="auto"/>
         <w:jc w:val="left"/>
         <w:rPr>
           <w:rFonts w:ascii="Liberation Serif" w:hAnsi="Liberation Serif"/>
@@ -2079,7 +2076,7 @@
         <w:tabs>
           <w:tab w:val="left" w:pos="9639"/>
         </w:tabs>
-        <w:spacing w:before="0" w:after="0" w:line="240" w:lineRule="auto"/>
+        <w:spacing w:after="0" w:before="0" w:line="240" w:lineRule="auto"/>
         <w:jc w:val="left"/>
         <w:rPr>
           <w:rFonts w:ascii="Liberation Serif" w:hAnsi="Liberation Serif"/>
@@ -2103,7 +2100,7 @@
         <w:tabs>
           <w:tab w:val="left" w:pos="9639"/>
         </w:tabs>
-        <w:spacing w:before="0" w:after="0" w:line="240" w:lineRule="auto"/>
+        <w:spacing w:after="0" w:before="0" w:line="240" w:lineRule="auto"/>
         <w:jc w:val="left"/>
         <w:rPr>
           <w:rFonts w:ascii="Liberation Serif" w:hAnsi="Liberation Serif"/>
@@ -2119,7 +2116,7 @@
         <w:tabs>
           <w:tab w:val="left" w:pos="9639"/>
         </w:tabs>
-        <w:spacing w:before="0" w:after="0" w:line="240" w:lineRule="auto"/>
+        <w:spacing w:after="0" w:before="0" w:line="240" w:lineRule="auto"/>
         <w:jc w:val="left"/>
         <w:rPr>
           <w:rFonts w:ascii="Liberation Serif" w:hAnsi="Liberation Serif"/>
@@ -2138,7 +2135,7 @@
     </w:p>
     <w:p>
       <w:pPr>
-        <w:spacing w:after="0" w:line="240" w:lineRule="auto"/>
+        <w:spacing w:after="0" w:before="0" w:line="240" w:lineRule="auto"/>
         <w:rPr>
           <w:rFonts w:ascii="Liberation Serif" w:hAnsi="Liberation Serif"/>
           <w:sz w:val="28"/>
@@ -2156,7 +2153,7 @@
     </w:p>
     <w:p>
       <w:pPr>
-        <w:spacing w:after="0" w:line="240" w:lineRule="auto"/>
+        <w:spacing w:after="0" w:before="0" w:line="240" w:lineRule="auto"/>
         <w:rPr>
           <w:rFonts w:ascii="Liberation Serif" w:hAnsi="Liberation Serif"/>
           <w:sz w:val="28"/>
@@ -2174,7 +2171,7 @@
     </w:p>
     <w:p>
       <w:pPr>
-        <w:spacing w:after="0" w:line="240" w:lineRule="auto"/>
+        <w:spacing w:after="0" w:before="0" w:line="240" w:lineRule="auto"/>
         <w:rPr>
           <w:rFonts w:ascii="Liberation Serif" w:hAnsi="Liberation Serif"/>
           <w:sz w:val="28"/>
@@ -2192,7 +2189,7 @@
     </w:p>
     <w:p>
       <w:pPr>
-        <w:spacing w:after="0" w:line="240" w:lineRule="auto"/>
+        <w:spacing w:after="0" w:before="0" w:line="240" w:lineRule="auto"/>
         <w:rPr>
           <w:rFonts w:ascii="Liberation Serif" w:hAnsi="Liberation Serif"/>
           <w:sz w:val="28"/>
@@ -2210,7 +2207,7 @@
     </w:p>
     <w:p>
       <w:pPr>
-        <w:spacing w:after="0" w:line="240" w:lineRule="auto"/>
+        <w:spacing w:after="0" w:before="0" w:line="240" w:lineRule="auto"/>
         <w:rPr>
           <w:rFonts w:ascii="Liberation Serif" w:hAnsi="Liberation Serif"/>
           <w:sz w:val="28"/>
@@ -2228,7 +2225,7 @@
     </w:p>
     <w:p>
       <w:pPr>
-        <w:spacing w:after="0" w:line="240" w:lineRule="auto"/>
+        <w:spacing w:after="0" w:before="0" w:line="240" w:lineRule="auto"/>
         <w:rPr>
           <w:rFonts w:ascii="Liberation Serif" w:hAnsi="Liberation Serif"/>
           <w:sz w:val="28"/>
@@ -2246,7 +2243,7 @@
     </w:p>
     <w:p>
       <w:pPr>
-        <w:spacing w:after="0" w:line="240" w:lineRule="auto"/>
+        <w:spacing w:after="0" w:before="0" w:line="240" w:lineRule="auto"/>
         <w:rPr>
           <w:rFonts w:ascii="Liberation Serif" w:hAnsi="Liberation Serif"/>
           <w:sz w:val="28"/>
@@ -2264,7 +2261,7 @@
     </w:p>
     <w:p>
       <w:pPr>
-        <w:spacing w:after="0" w:line="240" w:lineRule="auto"/>
+        <w:spacing w:after="0" w:before="0" w:line="240" w:lineRule="auto"/>
         <w:rPr>
           <w:rFonts w:ascii="Liberation Serif" w:hAnsi="Liberation Serif"/>
           <w:sz w:val="28"/>
@@ -2287,7 +2284,7 @@
         <w:tabs>
           <w:tab w:val="left" w:pos="9639"/>
         </w:tabs>
-        <w:spacing w:before="0" w:after="0" w:line="240" w:lineRule="auto"/>
+        <w:spacing w:after="0" w:before="0" w:line="240" w:lineRule="auto"/>
         <w:jc w:val="left"/>
         <w:rPr>
           <w:rFonts w:ascii="Liberation Serif" w:hAnsi="Liberation Serif"/>
@@ -2328,7 +2325,7 @@
         <w:tabs>
           <w:tab w:val="left" w:pos="9639"/>
         </w:tabs>
-        <w:spacing w:before="0" w:after="0" w:line="240" w:lineRule="auto"/>
+        <w:spacing w:after="0" w:before="0" w:line="240" w:lineRule="auto"/>
         <w:jc w:val="left"/>
         <w:rPr>
           <w:rFonts w:ascii="Liberation Serif" w:hAnsi="Liberation Serif"/>
@@ -2344,7 +2341,7 @@
         <w:tabs>
           <w:tab w:val="left" w:pos="9639"/>
         </w:tabs>
-        <w:spacing w:before="0" w:after="0" w:line="240" w:lineRule="auto"/>
+        <w:spacing w:after="0" w:before="0" w:line="240" w:lineRule="auto"/>
         <w:jc w:val="left"/>
         <w:rPr>
           <w:rFonts w:ascii="Liberation Serif" w:hAnsi="Liberation Serif"/>
@@ -2360,7 +2357,7 @@
         <w:tabs>
           <w:tab w:val="left" w:pos="9639"/>
         </w:tabs>
-        <w:spacing w:before="0" w:after="0" w:line="240" w:lineRule="auto"/>
+        <w:spacing w:after="0" w:before="0" w:line="240" w:lineRule="auto"/>
         <w:jc w:val="left"/>
         <w:rPr>
           <w:rFonts w:ascii="Liberation Serif" w:hAnsi="Liberation Serif"/>
@@ -2376,7 +2373,7 @@
         <w:tabs>
           <w:tab w:val="left" w:pos="9639"/>
         </w:tabs>
-        <w:spacing w:before="0" w:after="0" w:line="240" w:lineRule="auto"/>
+        <w:spacing w:after="0" w:before="0" w:line="240" w:lineRule="auto"/>
         <w:jc w:val="left"/>
         <w:rPr>
           <w:rFonts w:ascii="Liberation Serif" w:hAnsi="Liberation Serif"/>
@@ -2392,7 +2389,7 @@
         <w:tabs>
           <w:tab w:val="left" w:pos="9639"/>
         </w:tabs>
-        <w:spacing w:before="0" w:after="0" w:line="240" w:lineRule="auto"/>
+        <w:spacing w:after="0" w:before="0" w:line="240" w:lineRule="auto"/>
         <w:jc w:val="left"/>
         <w:rPr>
           <w:rFonts w:ascii="Liberation Serif" w:hAnsi="Liberation Serif"/>
@@ -2408,7 +2405,7 @@
         <w:tabs>
           <w:tab w:val="left" w:pos="9639"/>
         </w:tabs>
-        <w:spacing w:before="0" w:after="0" w:line="240" w:lineRule="auto"/>
+        <w:spacing w:after="0" w:before="0" w:line="240" w:lineRule="auto"/>
         <w:jc w:val="left"/>
         <w:rPr>
           <w:rFonts w:ascii="Liberation Serif" w:hAnsi="Liberation Serif"/>
@@ -2424,7 +2421,7 @@
         <w:tabs>
           <w:tab w:val="left" w:pos="9639"/>
         </w:tabs>
-        <w:spacing w:before="0" w:after="0" w:line="240" w:lineRule="auto"/>
+        <w:spacing w:after="0" w:before="0" w:line="240" w:lineRule="auto"/>
         <w:jc w:val="left"/>
         <w:rPr>
           <w:rFonts w:ascii="Liberation Serif" w:hAnsi="Liberation Serif"/>
@@ -2440,7 +2437,7 @@
         <w:tabs>
           <w:tab w:val="left" w:pos="9639"/>
         </w:tabs>
-        <w:spacing w:before="0" w:after="0" w:line="240" w:lineRule="auto"/>
+        <w:spacing w:after="0" w:before="0" w:line="240" w:lineRule="auto"/>
         <w:jc w:val="left"/>
         <w:rPr>
           <w:rFonts w:ascii="Liberation Serif" w:hAnsi="Liberation Serif"/>
@@ -2456,7 +2453,7 @@
         <w:tabs>
           <w:tab w:val="left" w:pos="9639"/>
         </w:tabs>
-        <w:spacing w:before="0" w:after="0" w:line="240" w:lineRule="auto"/>
+        <w:spacing w:after="0" w:before="0" w:line="240" w:lineRule="auto"/>
         <w:jc w:val="left"/>
         <w:rPr>
           <w:rFonts w:ascii="Liberation Serif" w:hAnsi="Liberation Serif"/>
@@ -2468,7 +2465,7 @@
     </w:p>
     <w:p>
       <w:pPr>
-        <w:spacing w:after="0" w:line="240" w:lineRule="auto"/>
+        <w:spacing w:after="0" w:before="0" w:line="240" w:lineRule="auto"/>
         <w:rPr>
           <w:rFonts w:ascii="Liberation Serif" w:hAnsi="Liberation Serif"/>
           <w:sz w:val="28"/>
@@ -2539,7 +2536,7 @@
     </w:p>
     <w:p>
       <w:pPr>
-        <w:spacing w:after="0" w:line="240" w:lineRule="auto"/>
+        <w:spacing w:after="0" w:before="0" w:line="240" w:lineRule="auto"/>
         <w:rPr>
           <w:rFonts w:ascii="Liberation Serif" w:hAnsi="Liberation Serif"/>
           <w:sz w:val="28"/>
@@ -2549,7 +2546,7 @@
     </w:p>
     <w:p>
       <w:pPr>
-        <w:spacing w:after="0" w:line="240" w:lineRule="auto"/>
+        <w:spacing w:after="0" w:before="0" w:line="240" w:lineRule="auto"/>
         <w:rPr>
           <w:rFonts w:ascii="Liberation Serif" w:hAnsi="Liberation Serif"/>
           <w:sz w:val="28"/>
@@ -2622,7 +2619,7 @@
         <w:tabs>
           <w:tab w:val="left" w:pos="9639"/>
         </w:tabs>
-        <w:spacing w:before="0" w:after="0" w:line="240" w:lineRule="auto"/>
+        <w:spacing w:after="0" w:before="0" w:line="240" w:lineRule="auto"/>
         <w:jc w:val="left"/>
         <w:rPr>
           <w:rFonts w:ascii="Liberation Serif" w:hAnsi="Liberation Serif"/>
@@ -2639,7 +2636,7 @@
         <w:tabs>
           <w:tab w:val="left" w:pos="9639"/>
         </w:tabs>
-        <w:spacing w:before="0" w:after="0" w:line="240" w:lineRule="auto"/>
+        <w:spacing w:after="0" w:before="0" w:line="240" w:lineRule="auto"/>
         <w:jc w:val="left"/>
         <w:rPr>
           <w:rFonts w:ascii="Liberation Serif" w:hAnsi="Liberation Serif"/>
@@ -2678,8 +2675,7 @@
         <w:tabs>
           <w:tab w:val="left" w:pos="10773"/>
         </w:tabs>
-        <w:spacing w:after="0" w:line="240" w:lineRule="auto"/>
-        <w:ind w:firstLine="1134"/>
+        <w:spacing w:after="0" w:before="0" w:line="240" w:lineRule="auto"/>
         <w:rPr>
           <w:rFonts w:ascii="Liberation Serif" w:hAnsi="Liberation Serif"/>
           <w:szCs w:val="28"/>
@@ -2688,7 +2684,7 @@
     </w:p>
     <w:p>
       <w:pPr>
-        <w:spacing w:after="0" w:line="240" w:lineRule="auto"/>
+        <w:spacing w:after="0" w:before="0" w:line="240" w:lineRule="auto"/>
         <w:rPr>
           <w:rFonts w:ascii="Liberation Serif" w:hAnsi="Liberation Serif"/>
           <w:sz w:val="28"/>
@@ -2770,12 +2766,12 @@
     </w:p>
     <w:p>
       <w:pPr>
-        <w:spacing w:after="0"/>
-      </w:pPr>
-    </w:p>
-    <w:p>
-      <w:pPr>
-        <w:spacing w:after="0"/>
+        <w:spacing w:after="0" w:before="0" w:line="240" w:lineRule="auto"/>
+      </w:pPr>
+    </w:p>
+    <w:p>
+      <w:pPr>
+        <w:spacing w:after="0" w:before="0" w:line="240" w:lineRule="auto"/>
         <w:jc w:val="center"/>
         <w:rPr>
           <w:rFonts w:ascii="Liberation Serif" w:hAnsi="Liberation Serif" w:cs="Times New Roman"/>
@@ -2786,26 +2782,24 @@
     </w:p>
     <w:p>
       <w:pPr>
-        <w:spacing w:after="0"/>
-      </w:pPr>
-    </w:p>
-    <w:p>
-      <w:pPr>
-        <w:spacing w:after="0" w:line="360" w:lineRule="auto"/>
-        <w:ind w:firstLine="709"/>
+        <w:spacing w:after="0" w:before="0" w:line="240" w:lineRule="auto"/>
+      </w:pPr>
+    </w:p>
+    <w:p>
+      <w:pPr>
+        <w:spacing w:after="0" w:before="0" w:line="240" w:lineRule="auto"/>
         <w:jc w:val="both"/>
       </w:pPr>
     </w:p>
     <w:p>
       <w:pPr>
-        <w:spacing w:after="0" w:line="360" w:lineRule="auto"/>
-        <w:ind w:firstLine="709"/>
+        <w:spacing w:after="0" w:before="0" w:line="240" w:lineRule="auto"/>
         <w:jc w:val="both"/>
       </w:pPr>
     </w:p>
     <w:p>
       <w:pPr>
-        <w:spacing w:after="0" w:line="240" w:lineRule="auto"/>
+        <w:spacing w:after="0" w:before="0" w:line="240" w:lineRule="auto"/>
         <w:rPr>
           <w:rFonts w:ascii="Liberation Serif" w:hAnsi="Liberation Serif"/>
           <w:sz w:val="28"/>
@@ -2815,7 +2809,7 @@
     </w:p>
     <w:p>
       <w:pPr>
-        <w:spacing w:after="0" w:line="240" w:lineRule="auto"/>
+        <w:spacing w:after="0" w:before="0" w:line="240" w:lineRule="auto"/>
         <w:rPr>
           <w:rFonts w:ascii="Liberation Serif" w:hAnsi="Liberation Serif"/>
           <w:sz w:val="28"/>
@@ -2825,7 +2819,7 @@
     </w:p>
     <w:p>
       <w:pPr>
-        <w:spacing w:after="0" w:line="240" w:lineRule="auto"/>
+        <w:spacing w:after="0" w:before="0" w:line="240" w:lineRule="auto"/>
         <w:rPr>
           <w:rFonts w:ascii="Liberation Serif" w:hAnsi="Liberation Serif"/>
           <w:sz w:val="28"/>
@@ -2835,7 +2829,7 @@
     </w:p>
     <w:p>
       <w:pPr>
-        <w:spacing w:after="0" w:line="240" w:lineRule="auto"/>
+        <w:spacing w:after="0" w:before="0" w:line="240" w:lineRule="auto"/>
         <w:rPr>
           <w:rFonts w:ascii="Liberation Serif" w:hAnsi="Liberation Serif"/>
           <w:sz w:val="28"/>
@@ -2845,7 +2839,7 @@
     </w:p>
     <w:p>
       <w:pPr>
-        <w:spacing w:after="0" w:line="240" w:lineRule="auto"/>
+        <w:spacing w:after="0" w:before="0" w:line="240" w:lineRule="auto"/>
         <w:rPr>
           <w:rFonts w:ascii="Liberation Serif" w:hAnsi="Liberation Serif"/>
           <w:sz w:val="28"/>
@@ -2855,7 +2849,7 @@
     </w:p>
     <w:p>
       <w:pPr>
-        <w:spacing w:after="0" w:line="240" w:lineRule="auto"/>
+        <w:spacing w:after="0" w:before="0" w:line="240" w:lineRule="auto"/>
         <w:rPr>
           <w:rFonts w:ascii="Liberation Serif" w:hAnsi="Liberation Serif"/>
           <w:sz w:val="28"/>
@@ -2865,7 +2859,7 @@
     </w:p>
     <w:p>
       <w:pPr>
-        <w:spacing w:after="0" w:line="240" w:lineRule="auto"/>
+        <w:spacing w:after="0" w:before="0" w:line="240" w:lineRule="auto"/>
         <w:rPr>
           <w:rFonts w:ascii="Liberation Serif" w:hAnsi="Liberation Serif"/>
           <w:sz w:val="28"/>
@@ -2875,7 +2869,7 @@
     </w:p>
     <w:p>
       <w:pPr>
-        <w:spacing w:after="0" w:line="240" w:lineRule="auto"/>
+        <w:spacing w:after="0" w:before="0" w:line="240" w:lineRule="auto"/>
         <w:rPr>
           <w:rFonts w:ascii="Liberation Serif" w:hAnsi="Liberation Serif"/>
           <w:sz w:val="28"/>
@@ -2885,7 +2879,7 @@
     </w:p>
     <w:p>
       <w:pPr>
-        <w:spacing w:after="0" w:line="240" w:lineRule="auto"/>
+        <w:spacing w:after="0" w:before="0" w:line="240" w:lineRule="auto"/>
         <w:rPr>
           <w:rFonts w:ascii="Liberation Serif" w:hAnsi="Liberation Serif"/>
           <w:sz w:val="28"/>
@@ -2895,7 +2889,7 @@
     </w:p>
     <w:p>
       <w:pPr>
-        <w:spacing w:after="0"/>
+        <w:spacing w:after="0" w:before="0" w:line="240" w:lineRule="auto"/>
         <w:jc w:val="center"/>
         <w:rPr>
           <w:rFonts w:ascii="Liberation Serif" w:hAnsi="Liberation Serif" w:cs="Times New Roman"/>
@@ -2914,8 +2908,7 @@
     </w:p>
     <w:p>
       <w:pPr>
-        <w:spacing w:after="0" w:line="360" w:lineRule="auto"/>
-        <w:ind w:firstLine="709"/>
+        <w:spacing w:after="0" w:before="0" w:line="240" w:lineRule="auto"/>
         <w:jc w:val="both"/>
         <w:rPr>
           <w:rFonts w:ascii="Liberation Serif" w:hAnsi="Liberation Serif"/>
@@ -2934,8 +2927,7 @@
     </w:p>
     <w:p>
       <w:pPr>
-        <w:spacing w:after="0" w:line="360" w:lineRule="auto"/>
-        <w:ind w:firstLine="709"/>
+        <w:spacing w:after="0" w:before="0" w:line="240" w:lineRule="auto"/>
         <w:jc w:val="both"/>
         <w:rPr>
           <w:rFonts w:ascii="Liberation Serif" w:hAnsi="Liberation Serif"/>
@@ -2954,8 +2946,7 @@
     </w:p>
     <w:p>
       <w:pPr>
-        <w:spacing w:after="0" w:line="360" w:lineRule="auto"/>
-        <w:ind w:firstLine="709"/>
+        <w:spacing w:after="0" w:before="0" w:line="240" w:lineRule="auto"/>
         <w:jc w:val="both"/>
         <w:rPr>
           <w:rFonts w:ascii="Liberation Serif" w:hAnsi="Liberation Serif"/>
@@ -2974,8 +2965,7 @@
     </w:p>
     <w:p>
       <w:pPr>
-        <w:spacing w:after="0" w:line="360" w:lineRule="auto"/>
-        <w:ind w:firstLine="709"/>
+        <w:spacing w:after="0" w:before="0" w:line="240" w:lineRule="auto"/>
         <w:jc w:val="both"/>
         <w:rPr>
           <w:rFonts w:ascii="Liberation Serif" w:hAnsi="Liberation Serif"/>
@@ -2994,8 +2984,7 @@
     </w:p>
     <w:p>
       <w:pPr>
-        <w:spacing w:after="0" w:line="360" w:lineRule="auto"/>
-        <w:ind w:firstLine="709"/>
+        <w:spacing w:after="0" w:before="0" w:line="240" w:lineRule="auto"/>
         <w:jc w:val="both"/>
         <w:rPr>
           <w:rFonts w:ascii="Liberation Serif" w:hAnsi="Liberation Serif"/>
@@ -3015,7 +3004,7 @@
     </w:p>
     <w:p>
       <w:pPr>
-        <w:spacing w:after="0"/>
+        <w:spacing w:after="0" w:before="0" w:line="240" w:lineRule="auto"/>
         <w:rPr>
           <w:rFonts w:ascii="Liberation Serif" w:hAnsi="Liberation Serif" w:cs="Times New Roman"/>
           <w:b/>
@@ -3025,7 +3014,7 @@
     </w:p>
     <w:p>
       <w:pPr>
-        <w:spacing w:after="0"/>
+        <w:spacing w:after="0" w:before="0" w:line="240" w:lineRule="auto"/>
         <w:rPr>
           <w:rFonts w:ascii="Liberation Serif" w:hAnsi="Liberation Serif" w:cs="Times New Roman"/>
           <w:b/>
@@ -3035,7 +3024,7 @@
     </w:p>
     <w:p>
       <w:pPr>
-        <w:spacing w:after="0"/>
+        <w:spacing w:after="0" w:before="0" w:line="240" w:lineRule="auto"/>
         <w:rPr>
           <w:rFonts w:ascii="Liberation Serif" w:hAnsi="Liberation Serif" w:cs="Times New Roman"/>
           <w:b/>
@@ -3045,7 +3034,7 @@
     </w:p>
     <w:p>
       <w:pPr>
-        <w:spacing w:after="0"/>
+        <w:spacing w:after="0" w:before="0" w:line="240" w:lineRule="auto"/>
         <w:rPr>
           <w:rFonts w:ascii="Liberation Serif" w:hAnsi="Liberation Serif" w:cs="Times New Roman"/>
           <w:b/>
@@ -3055,7 +3044,7 @@
     </w:p>
     <w:p>
       <w:pPr>
-        <w:spacing w:after="0"/>
+        <w:spacing w:after="0" w:before="0" w:line="240" w:lineRule="auto"/>
         <w:rPr>
           <w:rFonts w:ascii="Liberation Serif" w:hAnsi="Liberation Serif" w:cs="Times New Roman"/>
           <w:b/>
@@ -3065,7 +3054,7 @@
     </w:p>
     <w:p>
       <w:pPr>
-        <w:spacing w:after="0"/>
+        <w:spacing w:after="0" w:before="0" w:line="240" w:lineRule="auto"/>
         <w:rPr>
           <w:rFonts w:ascii="Liberation Serif" w:hAnsi="Liberation Serif" w:cs="Times New Roman"/>
           <w:b/>
@@ -3075,7 +3064,7 @@
     </w:p>
     <w:p>
       <w:pPr>
-        <w:spacing w:after="0"/>
+        <w:spacing w:after="0" w:before="0" w:line="240" w:lineRule="auto"/>
         <w:rPr>
           <w:rFonts w:ascii="Liberation Serif" w:hAnsi="Liberation Serif" w:cs="Times New Roman"/>
           <w:b/>
@@ -3085,7 +3074,7 @@
     </w:p>
     <w:p>
       <w:pPr>
-        <w:spacing w:after="0"/>
+        <w:spacing w:after="0" w:before="0" w:line="240" w:lineRule="auto"/>
         <w:rPr>
           <w:rFonts w:ascii="Liberation Serif" w:hAnsi="Liberation Serif" w:cs="Times New Roman"/>
           <w:b/>
@@ -3095,7 +3084,7 @@
     </w:p>
     <w:p>
       <w:pPr>
-        <w:spacing w:after="0"/>
+        <w:spacing w:after="0" w:before="0" w:line="240" w:lineRule="auto"/>
         <w:rPr>
           <w:rFonts w:ascii="Liberation Serif" w:hAnsi="Liberation Serif" w:cs="Times New Roman"/>
           <w:b/>
@@ -3105,7 +3094,7 @@
     </w:p>
     <w:p>
       <w:pPr>
-        <w:spacing w:after="0"/>
+        <w:spacing w:after="0" w:before="0" w:line="240" w:lineRule="auto"/>
         <w:rPr>
           <w:rFonts w:ascii="Liberation Serif" w:hAnsi="Liberation Serif" w:cs="Times New Roman"/>
           <w:b/>
@@ -3115,7 +3104,7 @@
     </w:p>
     <w:p>
       <w:pPr>
-        <w:spacing w:after="0"/>
+        <w:spacing w:after="0" w:before="0" w:line="240" w:lineRule="auto"/>
         <w:rPr>
           <w:rFonts w:ascii="Liberation Serif" w:hAnsi="Liberation Serif" w:cs="Times New Roman"/>
           <w:b/>
@@ -3125,7 +3114,7 @@
     </w:p>
     <w:p>
       <w:pPr>
-        <w:spacing w:after="0"/>
+        <w:spacing w:after="0" w:before="0" w:line="240" w:lineRule="auto"/>
         <w:rPr>
           <w:rFonts w:ascii="Liberation Serif" w:hAnsi="Liberation Serif" w:cs="Times New Roman"/>
           <w:b/>
@@ -3135,7 +3124,7 @@
     </w:p>
     <w:p>
       <w:pPr>
-        <w:spacing w:after="0"/>
+        <w:spacing w:after="0" w:before="0" w:line="240" w:lineRule="auto"/>
         <w:rPr>
           <w:rFonts w:ascii="Liberation Serif" w:hAnsi="Liberation Serif" w:cs="Times New Roman"/>
           <w:b/>
@@ -3145,7 +3134,7 @@
     </w:p>
     <w:p>
       <w:pPr>
-        <w:spacing w:after="0"/>
+        <w:spacing w:after="0" w:before="0" w:line="240" w:lineRule="auto"/>
         <w:rPr>
           <w:rFonts w:ascii="Liberation Serif" w:hAnsi="Liberation Serif" w:cs="Times New Roman"/>
           <w:b/>
@@ -3155,7 +3144,7 @@
     </w:p>
     <w:p>
       <w:pPr>
-        <w:spacing w:after="0"/>
+        <w:spacing w:after="0" w:before="0" w:line="240" w:lineRule="auto"/>
         <w:rPr>
           <w:rFonts w:ascii="Liberation Serif" w:hAnsi="Liberation Serif" w:cs="Times New Roman"/>
           <w:b/>
@@ -3165,7 +3154,7 @@
     </w:p>
     <w:p>
       <w:pPr>
-        <w:spacing w:after="0"/>
+        <w:spacing w:after="0" w:before="0" w:line="240" w:lineRule="auto"/>
         <w:rPr>
           <w:rFonts w:ascii="Liberation Serif" w:hAnsi="Liberation Serif" w:cs="Times New Roman"/>
           <w:b/>
@@ -3175,7 +3164,7 @@
     </w:p>
     <w:p>
       <w:pPr>
-        <w:spacing w:after="0"/>
+        <w:spacing w:after="0" w:before="0" w:line="240" w:lineRule="auto"/>
         <w:rPr>
           <w:rFonts w:ascii="Liberation Serif" w:hAnsi="Liberation Serif" w:cs="Times New Roman"/>
           <w:b/>
@@ -3185,7 +3174,7 @@
     </w:p>
     <w:p>
       <w:pPr>
-        <w:spacing w:after="0"/>
+        <w:spacing w:after="0" w:before="0" w:line="240" w:lineRule="auto"/>
         <w:rPr>
           <w:rFonts w:ascii="Liberation Serif" w:hAnsi="Liberation Serif" w:cs="Times New Roman"/>
           <w:b/>
@@ -3195,7 +3184,7 @@
     </w:p>
     <w:p>
       <w:pPr>
-        <w:spacing w:after="0"/>
+        <w:spacing w:after="0" w:before="0" w:line="240" w:lineRule="auto"/>
         <w:rPr>
           <w:rFonts w:ascii="Liberation Serif" w:hAnsi="Liberation Serif" w:cs="Times New Roman"/>
           <w:b/>
@@ -3205,7 +3194,7 @@
     </w:p>
     <w:p>
       <w:pPr>
-        <w:spacing w:after="0"/>
+        <w:spacing w:after="0" w:before="0" w:line="240" w:lineRule="auto"/>
         <w:rPr>
           <w:rFonts w:ascii="Liberation Serif" w:hAnsi="Liberation Serif" w:cs="Times New Roman"/>
           <w:b/>
@@ -3215,7 +3204,7 @@
     </w:p>
     <w:p>
       <w:pPr>
-        <w:spacing w:after="0"/>
+        <w:spacing w:after="0" w:before="0" w:line="240" w:lineRule="auto"/>
         <w:rPr>
           <w:rFonts w:ascii="Liberation Serif" w:hAnsi="Liberation Serif" w:cs="Times New Roman"/>
           <w:b/>
@@ -3225,7 +3214,7 @@
     </w:p>
     <w:p>
       <w:pPr>
-        <w:spacing w:after="0"/>
+        <w:spacing w:after="0" w:before="0" w:line="240" w:lineRule="auto"/>
         <w:rPr>
           <w:rFonts w:ascii="Liberation Serif" w:hAnsi="Liberation Serif" w:cs="Times New Roman"/>
           <w:b/>
@@ -3235,7 +3224,7 @@
     </w:p>
     <w:p>
       <w:pPr>
-        <w:spacing w:after="0"/>
+        <w:spacing w:after="0" w:before="0" w:line="240" w:lineRule="auto"/>
         <w:rPr>
           <w:rFonts w:ascii="Liberation Serif" w:hAnsi="Liberation Serif" w:cs="Times New Roman"/>
           <w:b/>
@@ -3245,7 +3234,7 @@
     </w:p>
     <w:p>
       <w:pPr>
-        <w:spacing w:after="0"/>
+        <w:spacing w:after="0" w:before="0" w:line="240" w:lineRule="auto"/>
         <w:rPr>
           <w:rFonts w:ascii="Liberation Serif" w:hAnsi="Liberation Serif" w:cs="Times New Roman"/>
           <w:b/>
@@ -3255,7 +3244,7 @@
     </w:p>
     <w:p>
       <w:pPr>
-        <w:spacing w:after="0"/>
+        <w:spacing w:after="0" w:before="0" w:line="240" w:lineRule="auto"/>
         <w:rPr>
           <w:rFonts w:ascii="Liberation Serif" w:hAnsi="Liberation Serif" w:cs="Times New Roman"/>
           <w:b/>
@@ -3265,7 +3254,7 @@
     </w:p>
     <w:p>
       <w:pPr>
-        <w:spacing w:after="0"/>
+        <w:spacing w:after="0" w:before="0" w:line="240" w:lineRule="auto"/>
         <w:rPr>
           <w:rFonts w:ascii="Liberation Serif" w:hAnsi="Liberation Serif" w:cs="Times New Roman"/>
           <w:b/>
@@ -3275,7 +3264,7 @@
     </w:p>
     <w:p>
       <w:pPr>
-        <w:spacing w:after="0"/>
+        <w:spacing w:after="0" w:before="0" w:line="240" w:lineRule="auto"/>
         <w:rPr>
           <w:rFonts w:ascii="Liberation Serif" w:hAnsi="Liberation Serif" w:cs="Times New Roman"/>
           <w:b/>
@@ -3285,7 +3274,7 @@
     </w:p>
     <w:p>
       <w:pPr>
-        <w:spacing w:after="0"/>
+        <w:spacing w:after="0" w:before="0" w:line="240" w:lineRule="auto"/>
         <w:rPr>
           <w:rFonts w:ascii="Liberation Serif" w:hAnsi="Liberation Serif" w:cs="Times New Roman"/>
           <w:b/>
@@ -3295,7 +3284,7 @@
     </w:p>
     <w:p>
       <w:pPr>
-        <w:spacing w:after="0"/>
+        <w:spacing w:after="0" w:before="0" w:line="240" w:lineRule="auto"/>
         <w:rPr>
           <w:rFonts w:ascii="Liberation Serif" w:hAnsi="Liberation Serif" w:cs="Times New Roman"/>
           <w:b/>
@@ -3305,7 +3294,7 @@
     </w:p>
     <w:p>
       <w:pPr>
-        <w:spacing w:after="0"/>
+        <w:spacing w:after="0" w:before="0" w:line="240" w:lineRule="auto"/>
         <w:rPr>
           <w:rFonts w:ascii="Liberation Serif" w:hAnsi="Liberation Serif" w:cs="Times New Roman"/>
           <w:b/>
@@ -3315,7 +3304,7 @@
     </w:p>
     <w:p>
       <w:pPr>
-        <w:spacing w:after="0"/>
+        <w:spacing w:after="0" w:before="0" w:line="240" w:lineRule="auto"/>
         <w:rPr>
           <w:rFonts w:ascii="Liberation Serif" w:hAnsi="Liberation Serif" w:cs="Times New Roman"/>
           <w:b/>
@@ -3325,7 +3314,7 @@
     </w:p>
     <w:p>
       <w:pPr>
-        <w:spacing w:after="0"/>
+        <w:spacing w:after="0" w:before="0" w:line="240" w:lineRule="auto"/>
         <w:rPr>
           <w:rFonts w:ascii="Liberation Serif" w:hAnsi="Liberation Serif" w:cs="Times New Roman"/>
           <w:b/>
@@ -3335,7 +3324,7 @@
     </w:p>
     <w:p>
       <w:pPr>
-        <w:spacing w:after="0"/>
+        <w:spacing w:after="0" w:before="0" w:line="240" w:lineRule="auto"/>
         <w:rPr>
           <w:rFonts w:ascii="Liberation Serif" w:hAnsi="Liberation Serif" w:cs="Times New Roman"/>
           <w:b/>
@@ -3345,7 +3334,7 @@
     </w:p>
     <w:p>
       <w:pPr>
-        <w:spacing w:after="0" w:line="360" w:lineRule="auto"/>
+        <w:spacing w:after="0" w:before="0" w:line="240" w:lineRule="auto"/>
         <w:jc w:val="center"/>
         <w:rPr>
           <w:rFonts w:ascii="Liberation Serif" w:hAnsi="Liberation Serif" w:cs="Liberation Serif"/>
@@ -3369,8 +3358,7 @@
     </w:p>
     <w:p>
       <w:pPr>
-        <w:spacing w:after="0" w:line="360" w:lineRule="auto"/>
-        <w:ind w:firstLine="709"/>
+        <w:spacing w:after="0" w:before="0" w:line="240" w:lineRule="auto"/>
         <w:jc w:val="both"/>
         <w:rPr>
           <w:rFonts w:ascii="Liberation Serif" w:hAnsi="Liberation Serif"/>
@@ -3393,8 +3381,7 @@
     </w:p>
     <w:p>
       <w:pPr>
-        <w:spacing w:after="0" w:line="360" w:lineRule="auto"/>
-        <w:ind w:firstLine="709"/>
+        <w:spacing w:after="0" w:before="0" w:line="240" w:lineRule="auto"/>
         <w:jc w:val="both"/>
         <w:rPr>
           <w:rFonts w:ascii="Liberation Serif" w:hAnsi="Liberation Serif"/>
@@ -3417,8 +3404,7 @@
     </w:p>
     <w:p>
       <w:pPr>
-        <w:spacing w:after="0" w:line="360" w:lineRule="auto"/>
-        <w:ind w:firstLine="709"/>
+        <w:spacing w:after="0" w:before="0" w:line="240" w:lineRule="auto"/>
         <w:jc w:val="both"/>
         <w:rPr>
           <w:rFonts w:ascii="Liberation Serif" w:hAnsi="Liberation Serif"/>
@@ -3441,8 +3427,7 @@
     </w:p>
     <w:p>
       <w:pPr>
-        <w:spacing w:after="0" w:line="360" w:lineRule="auto"/>
-        <w:ind w:firstLine="709"/>
+        <w:spacing w:after="0" w:before="0" w:line="240" w:lineRule="auto"/>
         <w:jc w:val="both"/>
         <w:rPr>
           <w:rFonts w:ascii="Liberation Serif" w:hAnsi="Liberation Serif"/>
@@ -3465,8 +3450,7 @@
     </w:p>
     <w:p>
       <w:pPr>
-        <w:spacing w:after="0" w:line="360" w:lineRule="auto"/>
-        <w:ind w:firstLine="709"/>
+        <w:spacing w:after="0" w:before="0" w:line="240" w:lineRule="auto"/>
         <w:jc w:val="both"/>
         <w:rPr>
           <w:rFonts w:ascii="Liberation Serif" w:hAnsi="Liberation Serif"/>
@@ -3489,7 +3473,7 @@
     </w:p>
     <w:p>
       <w:pPr>
-        <w:spacing w:after="0" w:line="360" w:lineRule="auto"/>
+        <w:spacing w:after="0" w:before="0" w:line="240" w:lineRule="auto"/>
         <w:rPr>
           <w:rFonts w:ascii="Liberation Serif" w:hAnsi="Liberation Serif" w:cs="Liberation Serif"/>
           <w:b/>
@@ -3501,7 +3485,7 @@
     </w:p>
     <w:p>
       <w:pPr>
-        <w:spacing w:after="0" w:line="360" w:lineRule="auto"/>
+        <w:spacing w:after="0" w:before="0" w:line="240" w:lineRule="auto"/>
         <w:rPr>
           <w:rFonts w:ascii="Liberation Serif" w:hAnsi="Liberation Serif" w:cs="Liberation Serif"/>
           <w:b/>
@@ -3513,7 +3497,7 @@
     </w:p>
     <w:p>
       <w:pPr>
-        <w:spacing w:after="0" w:line="360" w:lineRule="auto"/>
+        <w:spacing w:after="0" w:before="0" w:line="240" w:lineRule="auto"/>
         <w:rPr>
           <w:rFonts w:ascii="Liberation Serif" w:hAnsi="Liberation Serif" w:cs="Liberation Serif"/>
           <w:b/>
@@ -3525,7 +3509,7 @@
     </w:p>
     <w:p>
       <w:pPr>
-        <w:spacing w:after="0" w:line="360" w:lineRule="auto"/>
+        <w:spacing w:after="0" w:before="0" w:line="240" w:lineRule="auto"/>
         <w:rPr>
           <w:rFonts w:ascii="Liberation Serif" w:hAnsi="Liberation Serif" w:cs="Liberation Serif"/>
           <w:b/>
@@ -3537,7 +3521,7 @@
     </w:p>
     <w:p>
       <w:pPr>
-        <w:spacing w:after="0" w:line="360" w:lineRule="auto"/>
+        <w:spacing w:after="0" w:before="0" w:line="240" w:lineRule="auto"/>
         <w:jc w:val="center"/>
         <w:rPr>
           <w:rFonts w:ascii="Liberation Serif" w:hAnsi="Liberation Serif" w:cs="Times New Roman"/>
@@ -3590,7 +3574,7 @@
             <w:pPr>
               <w:pStyle w:val="ds-markdown-paragraph"/>
               <w:shd w:val="clear" w:color="auto" w:fill="FFFFFF"/>
-              <w:spacing w:before="0" w:beforeAutospacing="0" w:after="0" w:afterAutospacing="0" w:line="360" w:lineRule="auto"/>
+              <w:spacing w:after="0" w:before="0" w:line="240" w:lineRule="auto"/>
               <w:jc w:val="both"/>
               <w:rPr>
                 <w:rFonts w:ascii="Liberation Serif" w:hAnsi="Liberation Serif"/>
@@ -3630,7 +3614,7 @@
           </w:tcPr>
           <w:p>
             <w:pPr>
-              <w:spacing w:after="0" w:line="360" w:lineRule="auto"/>
+              <w:spacing w:after="0" w:before="0" w:line="240" w:lineRule="auto"/>
               <w:jc w:val="both"/>
               <w:rPr>
                 <w:rFonts w:ascii="Liberation Serif" w:hAnsi="Liberation Serif" w:cs="Times New Roman"/>
@@ -3656,7 +3640,7 @@
           </w:tcPr>
           <w:p>
             <w:pPr>
-              <w:spacing w:after="0" w:line="360" w:lineRule="auto"/>
+              <w:spacing w:after="0" w:before="0" w:line="240" w:lineRule="auto"/>
               <w:jc w:val="both"/>
               <w:rPr>
                 <w:rFonts w:ascii="Liberation Serif" w:hAnsi="Liberation Serif" w:cs="Times New Roman"/>
@@ -3683,7 +3667,7 @@
           </w:tcPr>
           <w:p>
             <w:pPr>
-              <w:spacing w:after="0" w:line="360" w:lineRule="auto"/>
+              <w:spacing w:after="0" w:before="0" w:line="240" w:lineRule="auto"/>
               <w:jc w:val="both"/>
               <w:rPr>
                 <w:rFonts w:ascii="Liberation Serif" w:hAnsi="Liberation Serif" w:cs="Times New Roman"/>
@@ -3697,7 +3681,7 @@
           </w:p>
           <w:p>
             <w:pPr>
-              <w:spacing w:after="0" w:line="360" w:lineRule="auto"/>
+              <w:spacing w:after="0" w:before="0" w:line="240" w:lineRule="auto"/>
               <w:jc w:val="both"/>
               <w:rPr>
                 <w:rFonts w:ascii="Liberation Serif" w:hAnsi="Liberation Serif" w:cs="Times New Roman"/>
@@ -3715,7 +3699,7 @@
           </w:tcPr>
           <w:p>
             <w:pPr>
-              <w:spacing w:after="0" w:line="360" w:lineRule="auto"/>
+              <w:spacing w:after="0" w:before="0" w:line="240" w:lineRule="auto"/>
               <w:jc w:val="both"/>
               <w:rPr>
                 <w:rFonts w:ascii="Liberation Serif" w:hAnsi="Liberation Serif" w:cs="Times New Roman"/>
@@ -3740,7 +3724,7 @@
           </w:tcPr>
           <w:p>
             <w:pPr>
-              <w:spacing w:after="0" w:line="360" w:lineRule="auto"/>
+              <w:spacing w:after="0" w:before="0" w:line="240" w:lineRule="auto"/>
               <w:jc w:val="both"/>
               <w:rPr>
                 <w:rFonts w:ascii="Liberation Serif" w:hAnsi="Liberation Serif" w:cs="Times New Roman"/>
@@ -3766,7 +3750,7 @@
           </w:tcPr>
           <w:p>
             <w:pPr>
-              <w:spacing w:after="0" w:line="360" w:lineRule="auto"/>
+              <w:spacing w:after="0" w:before="0" w:line="240" w:lineRule="auto"/>
               <w:jc w:val="both"/>
               <w:rPr>
                 <w:rFonts w:ascii="Liberation Serif" w:hAnsi="Liberation Serif" w:cs="Times New Roman"/>
@@ -3791,7 +3775,7 @@
           </w:tcPr>
           <w:p>
             <w:pPr>
-              <w:spacing w:after="0" w:line="360" w:lineRule="auto"/>
+              <w:spacing w:after="0" w:before="0" w:line="240" w:lineRule="auto"/>
               <w:jc w:val="both"/>
               <w:rPr>
                 <w:rFonts w:ascii="Liberation Serif" w:hAnsi="Liberation Serif" w:cs="Times New Roman"/>
@@ -3817,7 +3801,7 @@
           </w:tcPr>
           <w:p>
             <w:pPr>
-              <w:spacing w:after="0" w:line="360" w:lineRule="auto"/>
+              <w:spacing w:after="0" w:before="0" w:line="240" w:lineRule="auto"/>
               <w:jc w:val="both"/>
               <w:rPr>
                 <w:rFonts w:ascii="Liberation Serif" w:hAnsi="Liberation Serif" w:cs="Times New Roman"/>
@@ -3842,7 +3826,7 @@
           </w:tcPr>
           <w:p>
             <w:pPr>
-              <w:spacing w:after="0" w:line="360" w:lineRule="auto"/>
+              <w:spacing w:after="0" w:before="0" w:line="240" w:lineRule="auto"/>
               <w:jc w:val="both"/>
               <w:rPr>
                 <w:rFonts w:ascii="Liberation Serif" w:hAnsi="Liberation Serif" w:cs="Times New Roman"/>
@@ -3856,7 +3840,7 @@
           </w:p>
           <w:p>
             <w:pPr>
-              <w:spacing w:after="0" w:line="360" w:lineRule="auto"/>
+              <w:spacing w:after="0" w:before="0" w:line="240" w:lineRule="auto"/>
               <w:jc w:val="both"/>
               <w:rPr>
                 <w:rFonts w:ascii="Liberation Serif" w:hAnsi="Liberation Serif" w:cs="Times New Roman"/>
@@ -3874,7 +3858,7 @@
           </w:tcPr>
           <w:p>
             <w:pPr>
-              <w:spacing w:after="0" w:line="360" w:lineRule="auto"/>
+              <w:spacing w:after="0" w:before="0" w:line="240" w:lineRule="auto"/>
               <w:jc w:val="both"/>
               <w:rPr>
                 <w:rFonts w:ascii="Liberation Serif" w:hAnsi="Liberation Serif" w:cs="Times New Roman"/>
@@ -3901,7 +3885,7 @@
           </w:tcPr>
           <w:p>
             <w:pPr>
-              <w:spacing w:after="0" w:line="360" w:lineRule="auto"/>
+              <w:spacing w:after="0" w:before="0" w:line="240" w:lineRule="auto"/>
               <w:jc w:val="both"/>
               <w:rPr>
                 <w:rFonts w:ascii="Liberation Serif" w:hAnsi="Liberation Serif" w:cs="Times New Roman"/>
@@ -3915,7 +3899,7 @@
           </w:p>
           <w:p>
             <w:pPr>
-              <w:spacing w:after="0" w:line="360" w:lineRule="auto"/>
+              <w:spacing w:after="0" w:before="0" w:line="240" w:lineRule="auto"/>
               <w:jc w:val="both"/>
               <w:rPr>
                 <w:rFonts w:ascii="Liberation Serif" w:hAnsi="Liberation Serif" w:cs="Times New Roman"/>
@@ -3933,7 +3917,7 @@
           </w:tcPr>
           <w:p>
             <w:pPr>
-              <w:spacing w:after="0" w:line="360" w:lineRule="auto"/>
+              <w:spacing w:after="0" w:before="0" w:line="240" w:lineRule="auto"/>
               <w:jc w:val="both"/>
               <w:rPr>
                 <w:rFonts w:ascii="Liberation Serif" w:hAnsi="Liberation Serif" w:cs="Times New Roman"/>
@@ -3976,7 +3960,7 @@
           </w:tcPr>
           <w:p>
             <w:pPr>
-              <w:spacing w:after="0" w:line="360" w:lineRule="auto"/>
+              <w:spacing w:after="0" w:before="0" w:line="240" w:lineRule="auto"/>
               <w:jc w:val="both"/>
               <w:rPr>
                 <w:rFonts w:ascii="Liberation Serif" w:hAnsi="Liberation Serif" w:cs="Times New Roman"/>
@@ -4004,7 +3988,7 @@
             <w:pPr>
               <w:pStyle w:val="ds-markdown-paragraph"/>
               <w:shd w:val="clear" w:color="auto" w:fill="FFFFFF"/>
-              <w:spacing w:before="0" w:beforeAutospacing="0" w:after="0" w:afterAutospacing="0" w:line="360" w:lineRule="auto"/>
+              <w:spacing w:after="0" w:before="0" w:line="240" w:lineRule="auto"/>
               <w:jc w:val="both"/>
               <w:rPr>
                 <w:rFonts w:ascii="Liberation Serif" w:hAnsi="Liberation Serif"/>
@@ -4030,7 +4014,7 @@
           </w:tcPr>
           <w:p>
             <w:pPr>
-              <w:spacing w:after="0" w:line="360" w:lineRule="auto"/>
+              <w:spacing w:after="0" w:before="0" w:line="240" w:lineRule="auto"/>
               <w:jc w:val="both"/>
               <w:rPr>
                 <w:rFonts w:ascii="Liberation Serif" w:hAnsi="Liberation Serif" w:cs="Times New Roman"/>
@@ -4058,7 +4042,7 @@
             <w:pPr>
               <w:pStyle w:val="ds-markdown-paragraph"/>
               <w:shd w:val="clear" w:color="auto" w:fill="FFFFFF"/>
-              <w:spacing w:before="0" w:beforeAutospacing="0" w:after="0" w:afterAutospacing="0" w:line="360" w:lineRule="auto"/>
+              <w:spacing w:after="0" w:before="0" w:line="240" w:lineRule="auto"/>
               <w:jc w:val="both"/>
               <w:rPr>
                 <w:rFonts w:ascii="Liberation Serif" w:hAnsi="Liberation Serif"/>
@@ -4084,7 +4068,7 @@
           </w:tcPr>
           <w:p>
             <w:pPr>
-              <w:spacing w:after="0" w:line="360" w:lineRule="auto"/>
+              <w:spacing w:after="0" w:before="0" w:line="240" w:lineRule="auto"/>
               <w:jc w:val="both"/>
               <w:rPr>
                 <w:rFonts w:ascii="Liberation Serif" w:hAnsi="Liberation Serif" w:cs="Times New Roman"/>
@@ -4098,7 +4082,7 @@
           </w:p>
           <w:p>
             <w:pPr>
-              <w:spacing w:after="0" w:line="360" w:lineRule="auto"/>
+              <w:spacing w:after="0" w:before="0" w:line="240" w:lineRule="auto"/>
               <w:jc w:val="both"/>
               <w:rPr>
                 <w:rFonts w:ascii="Liberation Serif" w:hAnsi="Liberation Serif" w:cs="Times New Roman"/>
@@ -4116,7 +4100,7 @@
           </w:tcPr>
           <w:p>
             <w:pPr>
-              <w:spacing w:after="0" w:line="360" w:lineRule="auto"/>
+              <w:spacing w:after="0" w:before="0" w:line="240" w:lineRule="auto"/>
               <w:jc w:val="both"/>
               <w:rPr>
                 <w:rFonts w:ascii="Liberation Serif" w:hAnsi="Liberation Serif" w:cs="Times New Roman"/>
@@ -4143,7 +4127,7 @@
           </w:tcPr>
           <w:p>
             <w:pPr>
-              <w:spacing w:after="0" w:line="360" w:lineRule="auto"/>
+              <w:spacing w:after="0" w:before="0" w:line="240" w:lineRule="auto"/>
               <w:jc w:val="both"/>
               <w:rPr>
                 <w:rFonts w:ascii="Liberation Serif" w:hAnsi="Liberation Serif" w:cs="Times New Roman"/>
@@ -4169,7 +4153,7 @@
           </w:tcPr>
           <w:p>
             <w:pPr>
-              <w:spacing w:after="0" w:line="360" w:lineRule="auto"/>
+              <w:spacing w:after="0" w:before="0" w:line="240" w:lineRule="auto"/>
               <w:jc w:val="both"/>
               <w:rPr>
                 <w:rFonts w:ascii="Liberation Serif" w:hAnsi="Liberation Serif" w:cs="Times New Roman"/>
@@ -4194,7 +4178,7 @@
           </w:tcPr>
           <w:p>
             <w:pPr>
-              <w:spacing w:after="0" w:line="360" w:lineRule="auto"/>
+              <w:spacing w:after="0" w:before="0" w:line="240" w:lineRule="auto"/>
               <w:jc w:val="both"/>
               <w:rPr>
                 <w:rFonts w:ascii="Liberation Serif" w:hAnsi="Liberation Serif" w:cs="Times New Roman"/>
@@ -4220,7 +4204,7 @@
           </w:tcPr>
           <w:p>
             <w:pPr>
-              <w:spacing w:after="0" w:line="360" w:lineRule="auto"/>
+              <w:spacing w:after="0" w:before="0" w:line="240" w:lineRule="auto"/>
               <w:jc w:val="both"/>
               <w:rPr>
                 <w:rFonts w:ascii="Liberation Serif" w:hAnsi="Liberation Serif" w:cs="Times New Roman"/>
@@ -4245,7 +4229,7 @@
           </w:tcPr>
           <w:p>
             <w:pPr>
-              <w:spacing w:after="0" w:line="360" w:lineRule="auto"/>
+              <w:spacing w:after="0" w:before="0" w:line="240" w:lineRule="auto"/>
               <w:jc w:val="both"/>
               <w:rPr>
                 <w:rFonts w:ascii="Liberation Serif" w:hAnsi="Liberation Serif" w:cs="Times New Roman"/>
@@ -4271,7 +4255,7 @@
           </w:tcPr>
           <w:p>
             <w:pPr>
-              <w:spacing w:after="0" w:line="360" w:lineRule="auto"/>
+              <w:spacing w:after="0" w:before="0" w:line="240" w:lineRule="auto"/>
               <w:jc w:val="both"/>
               <w:rPr>
                 <w:rFonts w:ascii="Liberation Serif" w:hAnsi="Liberation Serif" w:cs="Times New Roman"/>
@@ -4296,7 +4280,7 @@
           </w:tcPr>
           <w:p>
             <w:pPr>
-              <w:spacing w:after="0" w:line="360" w:lineRule="auto"/>
+              <w:spacing w:after="0" w:before="0" w:line="240" w:lineRule="auto"/>
               <w:jc w:val="both"/>
               <w:rPr>
                 <w:rFonts w:ascii="Liberation Serif" w:hAnsi="Liberation Serif" w:cs="Times New Roman"/>
@@ -4310,7 +4294,7 @@
           </w:p>
           <w:p>
             <w:pPr>
-              <w:spacing w:after="0" w:line="360" w:lineRule="auto"/>
+              <w:spacing w:after="0" w:before="0" w:line="240" w:lineRule="auto"/>
               <w:jc w:val="both"/>
               <w:rPr>
                 <w:rFonts w:ascii="Liberation Serif" w:hAnsi="Liberation Serif" w:cs="Times New Roman"/>
@@ -4328,7 +4312,7 @@
           </w:tcPr>
           <w:p>
             <w:pPr>
-              <w:spacing w:after="0" w:line="360" w:lineRule="auto"/>
+              <w:spacing w:after="0" w:before="0" w:line="240" w:lineRule="auto"/>
               <w:jc w:val="both"/>
               <w:rPr>
                 <w:rFonts w:ascii="Liberation Serif" w:hAnsi="Liberation Serif" w:cs="Times New Roman"/>
@@ -4352,7 +4336,7 @@
           </w:tcPr>
           <w:p>
             <w:pPr>
-              <w:spacing w:after="0" w:line="360" w:lineRule="auto"/>
+              <w:spacing w:after="0" w:before="0" w:line="240" w:lineRule="auto"/>
               <w:jc w:val="both"/>
               <w:rPr>
                 <w:rFonts w:ascii="Liberation Serif" w:hAnsi="Liberation Serif" w:cs="Times New Roman"/>
@@ -4378,7 +4362,7 @@
           </w:tcPr>
           <w:p>
             <w:pPr>
-              <w:spacing w:after="0" w:line="360" w:lineRule="auto"/>
+              <w:spacing w:after="0" w:before="0" w:line="240" w:lineRule="auto"/>
               <w:jc w:val="both"/>
               <w:rPr>
                 <w:rFonts w:ascii="Liberation Serif" w:hAnsi="Liberation Serif" w:cs="Times New Roman"/>
@@ -4402,7 +4386,7 @@
           </w:tcPr>
           <w:p>
             <w:pPr>
-              <w:spacing w:after="0" w:line="360" w:lineRule="auto"/>
+              <w:spacing w:after="0" w:before="0" w:line="240" w:lineRule="auto"/>
               <w:jc w:val="both"/>
               <w:rPr>
                 <w:rFonts w:ascii="Liberation Serif" w:hAnsi="Liberation Serif" w:cs="Times New Roman"/>

</xml_diff>

<commit_message>
Split doc into 2 sections: pre-intro (single spacing, no indent) + body (1.5, indent, justify via Normal style)
</commit_message>
<xml_diff>
--- a/ВКР_Воробьев.docx
+++ b/ВКР_Воробьев.docx
@@ -1449,7 +1449,6 @@
           <w:tab w:val="left" w:pos="9639"/>
         </w:tabs>
         <w:spacing w:after="0" w:before="0" w:line="240" w:lineRule="auto"/>
-        <w:jc w:val="both"/>
         <w:rPr>
           <w:rFonts w:ascii="Liberation Serif" w:hAnsi="Liberation Serif"/>
           <w:sz w:val="24"/>
@@ -1668,7 +1667,6 @@
     <w:p>
       <w:pPr>
         <w:spacing w:after="0" w:before="0" w:line="240" w:lineRule="auto"/>
-        <w:jc w:val="both"/>
         <w:rPr>
           <w:rFonts w:ascii="Liberation Serif" w:hAnsi="Liberation Serif"/>
         </w:rPr>
@@ -1693,7 +1691,6 @@
         <w:pStyle w:val="ds-markdown-paragraph"/>
         <w:shd w:val="clear" w:color="auto" w:fill="FFFFFF"/>
         <w:spacing w:after="0" w:before="0" w:line="240" w:lineRule="auto"/>
-        <w:jc w:val="both"/>
         <w:rPr>
           <w:rFonts w:ascii="Liberation Serif" w:hAnsi="Liberation Serif"/>
           <w:color w:val="FF0000"/>
@@ -2788,13 +2785,11 @@
     <w:p>
       <w:pPr>
         <w:spacing w:after="0" w:before="0" w:line="240" w:lineRule="auto"/>
-        <w:jc w:val="both"/>
       </w:pPr>
     </w:p>
     <w:p>
       <w:pPr>
         <w:spacing w:after="0" w:before="0" w:line="240" w:lineRule="auto"/>
-        <w:jc w:val="both"/>
       </w:pPr>
     </w:p>
     <w:p>
@@ -2909,7 +2904,6 @@
     <w:p>
       <w:pPr>
         <w:spacing w:after="0" w:before="0" w:line="240" w:lineRule="auto"/>
-        <w:jc w:val="both"/>
         <w:rPr>
           <w:rFonts w:ascii="Liberation Serif" w:hAnsi="Liberation Serif"/>
           <w:sz w:val="28"/>
@@ -2928,7 +2922,6 @@
     <w:p>
       <w:pPr>
         <w:spacing w:after="0" w:before="0" w:line="240" w:lineRule="auto"/>
-        <w:jc w:val="both"/>
         <w:rPr>
           <w:rFonts w:ascii="Liberation Serif" w:hAnsi="Liberation Serif"/>
           <w:sz w:val="28"/>
@@ -2947,7 +2940,6 @@
     <w:p>
       <w:pPr>
         <w:spacing w:after="0" w:before="0" w:line="240" w:lineRule="auto"/>
-        <w:jc w:val="both"/>
         <w:rPr>
           <w:rFonts w:ascii="Liberation Serif" w:hAnsi="Liberation Serif"/>
           <w:sz w:val="28"/>
@@ -2966,7 +2958,6 @@
     <w:p>
       <w:pPr>
         <w:spacing w:after="0" w:before="0" w:line="240" w:lineRule="auto"/>
-        <w:jc w:val="both"/>
         <w:rPr>
           <w:rFonts w:ascii="Liberation Serif" w:hAnsi="Liberation Serif"/>
           <w:sz w:val="28"/>
@@ -2985,7 +2976,6 @@
     <w:p>
       <w:pPr>
         <w:spacing w:after="0" w:before="0" w:line="240" w:lineRule="auto"/>
-        <w:jc w:val="both"/>
         <w:rPr>
           <w:rFonts w:ascii="Liberation Serif" w:hAnsi="Liberation Serif"/>
           <w:sz w:val="28"/>
@@ -3359,7 +3349,6 @@
     <w:p>
       <w:pPr>
         <w:spacing w:after="0" w:before="0" w:line="240" w:lineRule="auto"/>
-        <w:jc w:val="both"/>
         <w:rPr>
           <w:rFonts w:ascii="Liberation Serif" w:hAnsi="Liberation Serif"/>
           <w:color w:val="FF0000"/>
@@ -3382,7 +3371,6 @@
     <w:p>
       <w:pPr>
         <w:spacing w:after="0" w:before="0" w:line="240" w:lineRule="auto"/>
-        <w:jc w:val="both"/>
         <w:rPr>
           <w:rFonts w:ascii="Liberation Serif" w:hAnsi="Liberation Serif"/>
           <w:color w:val="FF0000"/>
@@ -3405,7 +3393,6 @@
     <w:p>
       <w:pPr>
         <w:spacing w:after="0" w:before="0" w:line="240" w:lineRule="auto"/>
-        <w:jc w:val="both"/>
         <w:rPr>
           <w:rFonts w:ascii="Liberation Serif" w:hAnsi="Liberation Serif"/>
           <w:color w:val="FF0000"/>
@@ -3428,7 +3415,6 @@
     <w:p>
       <w:pPr>
         <w:spacing w:after="0" w:before="0" w:line="240" w:lineRule="auto"/>
-        <w:jc w:val="both"/>
         <w:rPr>
           <w:rFonts w:ascii="Liberation Serif" w:hAnsi="Liberation Serif"/>
           <w:color w:val="FF0000"/>
@@ -3451,7 +3437,6 @@
     <w:p>
       <w:pPr>
         <w:spacing w:after="0" w:before="0" w:line="240" w:lineRule="auto"/>
-        <w:jc w:val="both"/>
         <w:rPr>
           <w:rFonts w:ascii="Liberation Serif" w:hAnsi="Liberation Serif"/>
           <w:color w:val="FF0000"/>
@@ -3575,7 +3560,6 @@
               <w:pStyle w:val="ds-markdown-paragraph"/>
               <w:shd w:val="clear" w:color="auto" w:fill="FFFFFF"/>
               <w:spacing w:after="0" w:before="0" w:line="240" w:lineRule="auto"/>
-              <w:jc w:val="both"/>
               <w:rPr>
                 <w:rFonts w:ascii="Liberation Serif" w:hAnsi="Liberation Serif"/>
                 <w:bCs/>
@@ -3615,7 +3599,6 @@
           <w:p>
             <w:pPr>
               <w:spacing w:after="0" w:before="0" w:line="240" w:lineRule="auto"/>
-              <w:jc w:val="both"/>
               <w:rPr>
                 <w:rFonts w:ascii="Liberation Serif" w:hAnsi="Liberation Serif" w:cs="Times New Roman"/>
                 <w:sz w:val="28"/>
@@ -3641,7 +3624,6 @@
           <w:p>
             <w:pPr>
               <w:spacing w:after="0" w:before="0" w:line="240" w:lineRule="auto"/>
-              <w:jc w:val="both"/>
               <w:rPr>
                 <w:rFonts w:ascii="Liberation Serif" w:hAnsi="Liberation Serif" w:cs="Times New Roman"/>
                 <w:sz w:val="28"/>
@@ -3668,7 +3650,6 @@
           <w:p>
             <w:pPr>
               <w:spacing w:after="0" w:before="0" w:line="240" w:lineRule="auto"/>
-              <w:jc w:val="both"/>
               <w:rPr>
                 <w:rFonts w:ascii="Liberation Serif" w:hAnsi="Liberation Serif" w:cs="Times New Roman"/>
                 <w:sz w:val="28"/>
@@ -3682,7 +3663,6 @@
           <w:p>
             <w:pPr>
               <w:spacing w:after="0" w:before="0" w:line="240" w:lineRule="auto"/>
-              <w:jc w:val="both"/>
               <w:rPr>
                 <w:rFonts w:ascii="Liberation Serif" w:hAnsi="Liberation Serif" w:cs="Times New Roman"/>
                 <w:sz w:val="28"/>
@@ -3700,7 +3680,6 @@
           <w:p>
             <w:pPr>
               <w:spacing w:after="0" w:before="0" w:line="240" w:lineRule="auto"/>
-              <w:jc w:val="both"/>
               <w:rPr>
                 <w:rFonts w:ascii="Liberation Serif" w:hAnsi="Liberation Serif" w:cs="Times New Roman"/>
                 <w:sz w:val="28"/>
@@ -3725,7 +3704,6 @@
           <w:p>
             <w:pPr>
               <w:spacing w:after="0" w:before="0" w:line="240" w:lineRule="auto"/>
-              <w:jc w:val="both"/>
               <w:rPr>
                 <w:rFonts w:ascii="Liberation Serif" w:hAnsi="Liberation Serif" w:cs="Times New Roman"/>
                 <w:sz w:val="28"/>
@@ -3751,7 +3729,6 @@
           <w:p>
             <w:pPr>
               <w:spacing w:after="0" w:before="0" w:line="240" w:lineRule="auto"/>
-              <w:jc w:val="both"/>
               <w:rPr>
                 <w:rFonts w:ascii="Liberation Serif" w:hAnsi="Liberation Serif" w:cs="Times New Roman"/>
                 <w:sz w:val="28"/>
@@ -3776,7 +3753,6 @@
           <w:p>
             <w:pPr>
               <w:spacing w:after="0" w:before="0" w:line="240" w:lineRule="auto"/>
-              <w:jc w:val="both"/>
               <w:rPr>
                 <w:rFonts w:ascii="Liberation Serif" w:hAnsi="Liberation Serif" w:cs="Times New Roman"/>
                 <w:sz w:val="28"/>
@@ -3802,7 +3778,6 @@
           <w:p>
             <w:pPr>
               <w:spacing w:after="0" w:before="0" w:line="240" w:lineRule="auto"/>
-              <w:jc w:val="both"/>
               <w:rPr>
                 <w:rFonts w:ascii="Liberation Serif" w:hAnsi="Liberation Serif" w:cs="Times New Roman"/>
                 <w:sz w:val="28"/>
@@ -3827,7 +3802,6 @@
           <w:p>
             <w:pPr>
               <w:spacing w:after="0" w:before="0" w:line="240" w:lineRule="auto"/>
-              <w:jc w:val="both"/>
               <w:rPr>
                 <w:rFonts w:ascii="Liberation Serif" w:hAnsi="Liberation Serif" w:cs="Times New Roman"/>
                 <w:sz w:val="28"/>
@@ -3841,7 +3815,6 @@
           <w:p>
             <w:pPr>
               <w:spacing w:after="0" w:before="0" w:line="240" w:lineRule="auto"/>
-              <w:jc w:val="both"/>
               <w:rPr>
                 <w:rFonts w:ascii="Liberation Serif" w:hAnsi="Liberation Serif" w:cs="Times New Roman"/>
                 <w:sz w:val="28"/>
@@ -3859,7 +3832,6 @@
           <w:p>
             <w:pPr>
               <w:spacing w:after="0" w:before="0" w:line="240" w:lineRule="auto"/>
-              <w:jc w:val="both"/>
               <w:rPr>
                 <w:rFonts w:ascii="Liberation Serif" w:hAnsi="Liberation Serif" w:cs="Times New Roman"/>
                 <w:sz w:val="28"/>
@@ -3886,7 +3858,6 @@
           <w:p>
             <w:pPr>
               <w:spacing w:after="0" w:before="0" w:line="240" w:lineRule="auto"/>
-              <w:jc w:val="both"/>
               <w:rPr>
                 <w:rFonts w:ascii="Liberation Serif" w:hAnsi="Liberation Serif" w:cs="Times New Roman"/>
                 <w:sz w:val="28"/>
@@ -3900,7 +3871,6 @@
           <w:p>
             <w:pPr>
               <w:spacing w:after="0" w:before="0" w:line="240" w:lineRule="auto"/>
-              <w:jc w:val="both"/>
               <w:rPr>
                 <w:rFonts w:ascii="Liberation Serif" w:hAnsi="Liberation Serif" w:cs="Times New Roman"/>
                 <w:sz w:val="28"/>
@@ -3918,7 +3888,6 @@
           <w:p>
             <w:pPr>
               <w:spacing w:after="0" w:before="0" w:line="240" w:lineRule="auto"/>
-              <w:jc w:val="both"/>
               <w:rPr>
                 <w:rFonts w:ascii="Liberation Serif" w:hAnsi="Liberation Serif" w:cs="Times New Roman"/>
                 <w:sz w:val="28"/>
@@ -3961,7 +3930,6 @@
           <w:p>
             <w:pPr>
               <w:spacing w:after="0" w:before="0" w:line="240" w:lineRule="auto"/>
-              <w:jc w:val="both"/>
               <w:rPr>
                 <w:rFonts w:ascii="Liberation Serif" w:hAnsi="Liberation Serif" w:cs="Times New Roman"/>
                 <w:sz w:val="28"/>
@@ -3989,7 +3957,6 @@
               <w:pStyle w:val="ds-markdown-paragraph"/>
               <w:shd w:val="clear" w:color="auto" w:fill="FFFFFF"/>
               <w:spacing w:after="0" w:before="0" w:line="240" w:lineRule="auto"/>
-              <w:jc w:val="both"/>
               <w:rPr>
                 <w:rFonts w:ascii="Liberation Serif" w:hAnsi="Liberation Serif"/>
                 <w:color w:val="0F1115"/>
@@ -4015,7 +3982,6 @@
           <w:p>
             <w:pPr>
               <w:spacing w:after="0" w:before="0" w:line="240" w:lineRule="auto"/>
-              <w:jc w:val="both"/>
               <w:rPr>
                 <w:rFonts w:ascii="Liberation Serif" w:hAnsi="Liberation Serif" w:cs="Times New Roman"/>
                 <w:sz w:val="28"/>
@@ -4043,7 +4009,6 @@
               <w:pStyle w:val="ds-markdown-paragraph"/>
               <w:shd w:val="clear" w:color="auto" w:fill="FFFFFF"/>
               <w:spacing w:after="0" w:before="0" w:line="240" w:lineRule="auto"/>
-              <w:jc w:val="both"/>
               <w:rPr>
                 <w:rFonts w:ascii="Liberation Serif" w:hAnsi="Liberation Serif"/>
                 <w:color w:val="0F1115"/>
@@ -4069,7 +4034,6 @@
           <w:p>
             <w:pPr>
               <w:spacing w:after="0" w:before="0" w:line="240" w:lineRule="auto"/>
-              <w:jc w:val="both"/>
               <w:rPr>
                 <w:rFonts w:ascii="Liberation Serif" w:hAnsi="Liberation Serif" w:cs="Times New Roman"/>
                 <w:sz w:val="28"/>
@@ -4083,7 +4047,6 @@
           <w:p>
             <w:pPr>
               <w:spacing w:after="0" w:before="0" w:line="240" w:lineRule="auto"/>
-              <w:jc w:val="both"/>
               <w:rPr>
                 <w:rFonts w:ascii="Liberation Serif" w:hAnsi="Liberation Serif" w:cs="Times New Roman"/>
                 <w:sz w:val="28"/>
@@ -4101,7 +4064,6 @@
           <w:p>
             <w:pPr>
               <w:spacing w:after="0" w:before="0" w:line="240" w:lineRule="auto"/>
-              <w:jc w:val="both"/>
               <w:rPr>
                 <w:rFonts w:ascii="Liberation Serif" w:hAnsi="Liberation Serif" w:cs="Times New Roman"/>
                 <w:sz w:val="28"/>
@@ -4128,7 +4090,6 @@
           <w:p>
             <w:pPr>
               <w:spacing w:after="0" w:before="0" w:line="240" w:lineRule="auto"/>
-              <w:jc w:val="both"/>
               <w:rPr>
                 <w:rFonts w:ascii="Liberation Serif" w:hAnsi="Liberation Serif" w:cs="Times New Roman"/>
                 <w:sz w:val="28"/>
@@ -4154,7 +4115,6 @@
           <w:p>
             <w:pPr>
               <w:spacing w:after="0" w:before="0" w:line="240" w:lineRule="auto"/>
-              <w:jc w:val="both"/>
               <w:rPr>
                 <w:rFonts w:ascii="Liberation Serif" w:hAnsi="Liberation Serif" w:cs="Times New Roman"/>
                 <w:sz w:val="28"/>
@@ -4179,7 +4139,6 @@
           <w:p>
             <w:pPr>
               <w:spacing w:after="0" w:before="0" w:line="240" w:lineRule="auto"/>
-              <w:jc w:val="both"/>
               <w:rPr>
                 <w:rFonts w:ascii="Liberation Serif" w:hAnsi="Liberation Serif" w:cs="Times New Roman"/>
                 <w:sz w:val="28"/>
@@ -4205,7 +4164,6 @@
           <w:p>
             <w:pPr>
               <w:spacing w:after="0" w:before="0" w:line="240" w:lineRule="auto"/>
-              <w:jc w:val="both"/>
               <w:rPr>
                 <w:rFonts w:ascii="Liberation Serif" w:hAnsi="Liberation Serif" w:cs="Times New Roman"/>
                 <w:sz w:val="28"/>
@@ -4230,7 +4188,6 @@
           <w:p>
             <w:pPr>
               <w:spacing w:after="0" w:before="0" w:line="240" w:lineRule="auto"/>
-              <w:jc w:val="both"/>
               <w:rPr>
                 <w:rFonts w:ascii="Liberation Serif" w:hAnsi="Liberation Serif" w:cs="Times New Roman"/>
                 <w:sz w:val="28"/>
@@ -4256,7 +4213,6 @@
           <w:p>
             <w:pPr>
               <w:spacing w:after="0" w:before="0" w:line="240" w:lineRule="auto"/>
-              <w:jc w:val="both"/>
               <w:rPr>
                 <w:rFonts w:ascii="Liberation Serif" w:hAnsi="Liberation Serif" w:cs="Times New Roman"/>
                 <w:sz w:val="28"/>
@@ -4281,7 +4237,6 @@
           <w:p>
             <w:pPr>
               <w:spacing w:after="0" w:before="0" w:line="240" w:lineRule="auto"/>
-              <w:jc w:val="both"/>
               <w:rPr>
                 <w:rFonts w:ascii="Liberation Serif" w:hAnsi="Liberation Serif" w:cs="Times New Roman"/>
                 <w:sz w:val="28"/>
@@ -4295,7 +4250,6 @@
           <w:p>
             <w:pPr>
               <w:spacing w:after="0" w:before="0" w:line="240" w:lineRule="auto"/>
-              <w:jc w:val="both"/>
               <w:rPr>
                 <w:rFonts w:ascii="Liberation Serif" w:hAnsi="Liberation Serif" w:cs="Times New Roman"/>
                 <w:sz w:val="28"/>
@@ -4313,7 +4267,6 @@
           <w:p>
             <w:pPr>
               <w:spacing w:after="0" w:before="0" w:line="240" w:lineRule="auto"/>
-              <w:jc w:val="both"/>
               <w:rPr>
                 <w:rFonts w:ascii="Liberation Serif" w:hAnsi="Liberation Serif" w:cs="Times New Roman"/>
                 <w:sz w:val="28"/>
@@ -4337,7 +4290,6 @@
           <w:p>
             <w:pPr>
               <w:spacing w:after="0" w:before="0" w:line="240" w:lineRule="auto"/>
-              <w:jc w:val="both"/>
               <w:rPr>
                 <w:rFonts w:ascii="Liberation Serif" w:hAnsi="Liberation Serif" w:cs="Times New Roman"/>
                 <w:sz w:val="28"/>
@@ -4363,7 +4315,6 @@
           <w:p>
             <w:pPr>
               <w:spacing w:after="0" w:before="0" w:line="240" w:lineRule="auto"/>
-              <w:jc w:val="both"/>
               <w:rPr>
                 <w:rFonts w:ascii="Liberation Serif" w:hAnsi="Liberation Serif" w:cs="Times New Roman"/>
                 <w:sz w:val="28"/>
@@ -4387,7 +4338,6 @@
           <w:p>
             <w:pPr>
               <w:spacing w:after="0" w:before="0" w:line="240" w:lineRule="auto"/>
-              <w:jc w:val="both"/>
               <w:rPr>
                 <w:rFonts w:ascii="Liberation Serif" w:hAnsi="Liberation Serif" w:cs="Times New Roman"/>
                 <w:sz w:val="28"/>
@@ -26334,9 +26284,7 @@
     </w:rPrDefault>
     <w:pPrDefault>
       <w:pPr>
-        <w:spacing w:after="0" w:line="360" w:lineRule="auto"/>
-        <w:jc w:val="both"/>
-        <w:ind w:firstLine="709"/>
+        <w:spacing w:after="0" w:line="240" w:lineRule="auto"/>
       </w:pPr>
     </w:pPrDefault>
   </w:docDefaults>
@@ -26722,6 +26670,11 @@
     <w:name w:val="Normal"/>
     <w:qFormat/>
     <w:rsid w:val="003402B8"/>
+    <w:pPr>
+      <w:spacing w:after="0" w:line="360" w:lineRule="auto"/>
+      <w:jc w:val="both"/>
+      <w:ind w:firstLine="709"/>
+    </w:pPr>
   </w:style>
   <w:style w:type="paragraph" w:styleId="1">
     <w:name w:val="heading 1"/>

</xml_diff>